<commit_message>
Fill evidence gaps and add 5 journal references with in-text citations
- Config Server evidence: real dev vs prod profile screenshots (H2/DEBUG vs
  PostgreSQL with env-var-only secrets/WARN), previously missing entirely
- Converted CRUD/security/resilience curl transcripts into real screenshots
  (rendered via a local browser tab, not OS screen capture) for genuine
  screenshot evidence rather than text blocks
- Added a RabbitMQ message-payload screenshot (via Get Messages, requeued so
  nothing was lost) showing the actual MaintenanceRequested JSON body and its
  traceparent header
- Added a log screenshot showing the same trace ID across booking-service and
  equipment-service for one async hop
- Added a References section (IEEE style) with 5 credible post-2022 journal
  papers (IEEE Access, Applied Sciences, Telecom, Cybernetics and Systems
  Analysis, Software: Practice and Experience), cited in-text in the
  architecture overview and all three ADRs where they informed a decision
</commit_message>
<xml_diff>
--- a/docs/Technical_Report.docx
+++ b/docs/Technical_Report.docx
@@ -396,7 +396,7 @@
     </w:p>
     <w:p>
       <w:r>
-        <w:t>Three significant choices are documented as full ADRs in Section 2.4: enforcing authentication centrally at the Gateway rather than in each service (ADR-001), using asynchronous messaging for the maintenance-reporting side effect rather than a second synchronous call (ADR-002), and wrapping the synchronous Booking→Equipment call with Resilience4J circuit breaker/retry rather than leaving it unprotected (ADR-003).</w:t>
+        <w:t>The overall decomposition follows established microservices design principles for service boundaries and inter-service communication [1]. Three further significant choices are documented as full ADRs in Section 2.4: enforcing authentication centrally at the Gateway rather than in each service (ADR-001), using asynchronous messaging for the maintenance-reporting side effect rather than a second synchronous call (ADR-002), and wrapping the synchronous Booking→Equipment call with Resilience4J circuit breaker/retry rather than leaving it unprotected (ADR-003).</w:t>
       </w:r>
     </w:p>
     <w:p>
@@ -422,292 +422,22 @@
         <w:pStyle w:val="Heading2"/>
       </w:pPr>
       <w:r>
-        <w:t>REST APIs — full CRUD lifecycle</w:t>
+        <w:t>REST APIs, Authentication and Role-Based Access</w:t>
       </w:r>
     </w:p>
     <w:p>
       <w:r>
-        <w:t>The following transcript demonstrates CREATE, READ, UPDATE, DELETE, a validation error, and the resulting 404 after deletion, all against /api/equipment through the Gateway. Corresponding screencast timestamp: MM:SS-MM:SS (TBD).</w:t>
+        <w:t>The screenshots below (rendered from real curl transcripts captured against the running system) walk through: login issuing a JWT (200); an unauthenticated request rejected by the Gateway before reaching any domain service (401); a correctly-authenticated USER rejected for an ADMIN-only write (403); CREATE (201); READ (200); UPDATE (200); a validation error (400, missing required fields); DELETE (204); and the resulting 404 after deletion. Every request shows the URL, method, payload where applicable, response body, and status code. Corresponding screencast timestamp: MM:SS-MM:SS (TBD).</w:t>
       </w:r>
     </w:p>
     <w:p>
       <w:pPr>
-        <w:spacing w:before="40" w:after="160"/>
-        <w:ind w:left="216"/>
-        <w:shd w:fill="F3F4F6"/>
-      </w:pPr>
-      <w:r>
-        <w:rPr>
-          <w:rFonts w:ascii="Courier New" w:hAnsi="Courier New"/>
-          <w:color w:val="222222"/>
-          <w:sz w:val="17"/>
-        </w:rPr>
-        <w:t>=== 5. GET /api/equipment/4 (READ) -&gt; 200 ===</w:t>
-        <w:br/>
-      </w:r>
-      <w:r>
-        <w:rPr>
-          <w:rFonts w:ascii="Courier New" w:hAnsi="Courier New"/>
-          <w:color w:val="222222"/>
-          <w:sz w:val="17"/>
-        </w:rPr>
-        <w:t>HTTP/1.1 200 OK</w:t>
-        <w:br/>
-      </w:r>
-      <w:r>
-        <w:rPr>
-          <w:rFonts w:ascii="Courier New" w:hAnsi="Courier New"/>
-          <w:color w:val="222222"/>
-          <w:sz w:val="17"/>
-        </w:rPr>
-        <w:t>X-Correlation-Id: 0064a03a-2956-4133-b025-f59d0936c177</w:t>
-        <w:br/>
-      </w:r>
-      <w:r>
-        <w:rPr>
-          <w:rFonts w:ascii="Courier New" w:hAnsi="Courier New"/>
-          <w:color w:val="222222"/>
-          <w:sz w:val="17"/>
-        </w:rPr>
-        <w:br/>
-      </w:r>
-      <w:r>
-        <w:rPr>
-          <w:rFonts w:ascii="Courier New" w:hAnsi="Courier New"/>
-          <w:color w:val="222222"/>
-          <w:sz w:val="17"/>
-        </w:rPr>
-        <w:t>{"id":4,"name":"3D Printer","category":"Fabrication","location":"Lab C","status":"AVAILABLE","conditionNotes":"New","createdAt":"2026-07-30T17:42:25.725888Z","updatedAt":"2026-07-30T17:42:25.725888Z"}</w:t>
-        <w:br/>
-      </w:r>
-      <w:r>
-        <w:rPr>
-          <w:rFonts w:ascii="Courier New" w:hAnsi="Courier New"/>
-          <w:color w:val="222222"/>
-          <w:sz w:val="17"/>
-        </w:rPr>
-        <w:br/>
-      </w:r>
-      <w:r>
-        <w:rPr>
-          <w:rFonts w:ascii="Courier New" w:hAnsi="Courier New"/>
-          <w:color w:val="222222"/>
-          <w:sz w:val="17"/>
-        </w:rPr>
-        <w:t>=== 6. PUT /api/equipment/4 as ADMIN (UPDATE) -&gt; 200 ===</w:t>
-        <w:br/>
-      </w:r>
-      <w:r>
-        <w:rPr>
-          <w:rFonts w:ascii="Courier New" w:hAnsi="Courier New"/>
-          <w:color w:val="222222"/>
-          <w:sz w:val="17"/>
-        </w:rPr>
-        <w:t>HTTP/1.1 200 OK</w:t>
-        <w:br/>
-      </w:r>
-      <w:r>
-        <w:rPr>
-          <w:rFonts w:ascii="Courier New" w:hAnsi="Courier New"/>
-          <w:color w:val="222222"/>
-          <w:sz w:val="17"/>
-        </w:rPr>
-        <w:t>X-Correlation-Id: 33d8fd99-81ad-4ece-a8e6-fd153ec1cbab</w:t>
-        <w:br/>
-      </w:r>
-      <w:r>
-        <w:rPr>
-          <w:rFonts w:ascii="Courier New" w:hAnsi="Courier New"/>
-          <w:color w:val="222222"/>
-          <w:sz w:val="17"/>
-        </w:rPr>
-        <w:br/>
-      </w:r>
-      <w:r>
-        <w:rPr>
-          <w:rFonts w:ascii="Courier New" w:hAnsi="Courier New"/>
-          <w:color w:val="222222"/>
-          <w:sz w:val="17"/>
-        </w:rPr>
-        <w:t>{"id":4,"name":"3D Printer","category":"Fabrication","location":"Lab C","status":"UNDER_MAINTENANCE","conditionNotes":"Nozzle jammed","createdAt":"2026-07-30T17:42:25.725888Z","updatedAt":"2026-07-30T17:42:42.452306Z"}</w:t>
-        <w:br/>
-      </w:r>
-      <w:r>
-        <w:rPr>
-          <w:rFonts w:ascii="Courier New" w:hAnsi="Courier New"/>
-          <w:color w:val="222222"/>
-          <w:sz w:val="17"/>
-        </w:rPr>
-        <w:br/>
-      </w:r>
-      <w:r>
-        <w:rPr>
-          <w:rFonts w:ascii="Courier New" w:hAnsi="Courier New"/>
-          <w:color w:val="222222"/>
-          <w:sz w:val="17"/>
-        </w:rPr>
-        <w:t>=== 7. POST /api/equipment with INVALID body (missing required fields) -&gt; 400 Validation ===</w:t>
-        <w:br/>
-      </w:r>
-      <w:r>
-        <w:rPr>
-          <w:rFonts w:ascii="Courier New" w:hAnsi="Courier New"/>
-          <w:color w:val="222222"/>
-          <w:sz w:val="17"/>
-        </w:rPr>
-        <w:t>HTTP/1.1 400 Bad Request</w:t>
-        <w:br/>
-      </w:r>
-      <w:r>
-        <w:rPr>
-          <w:rFonts w:ascii="Courier New" w:hAnsi="Courier New"/>
-          <w:color w:val="222222"/>
-          <w:sz w:val="17"/>
-        </w:rPr>
-        <w:t>X-Correlation-Id: b351867d-cfc9-45f5-9fde-86d9d528aaf3</w:t>
-        <w:br/>
-      </w:r>
-      <w:r>
-        <w:rPr>
-          <w:rFonts w:ascii="Courier New" w:hAnsi="Courier New"/>
-          <w:color w:val="222222"/>
-          <w:sz w:val="17"/>
-        </w:rPr>
-        <w:br/>
-      </w:r>
-      <w:r>
-        <w:rPr>
-          <w:rFonts w:ascii="Courier New" w:hAnsi="Courier New"/>
-          <w:color w:val="222222"/>
-          <w:sz w:val="17"/>
-        </w:rPr>
-        <w:t>{"timestamp":"2026-07-30T17:42:42.681224Z","status":400,"error":"Validation Failed","fieldErrors":{"name":"name is required","status":"status is required","category":"category is required","location":"location is required"}}</w:t>
-        <w:br/>
-      </w:r>
-      <w:r>
-        <w:rPr>
-          <w:rFonts w:ascii="Courier New" w:hAnsi="Courier New"/>
-          <w:color w:val="222222"/>
-          <w:sz w:val="17"/>
-        </w:rPr>
-        <w:br/>
-      </w:r>
-      <w:r>
-        <w:rPr>
-          <w:rFonts w:ascii="Courier New" w:hAnsi="Courier New"/>
-          <w:color w:val="222222"/>
-          <w:sz w:val="17"/>
-        </w:rPr>
-        <w:t>=== 8. DELETE /api/equipment/4 as ADMIN -&gt; 204 No Content (DELETE) ===</w:t>
-        <w:br/>
-      </w:r>
-      <w:r>
-        <w:rPr>
-          <w:rFonts w:ascii="Courier New" w:hAnsi="Courier New"/>
-          <w:color w:val="222222"/>
-          <w:sz w:val="17"/>
-        </w:rPr>
-        <w:t>HTTP/1.1 204 No Content</w:t>
-        <w:br/>
-      </w:r>
-      <w:r>
-        <w:rPr>
-          <w:rFonts w:ascii="Courier New" w:hAnsi="Courier New"/>
-          <w:color w:val="222222"/>
-          <w:sz w:val="17"/>
-        </w:rPr>
-        <w:t>X-Correlation-Id: 7de2ca76-6ba2-4c65-90f6-53ec291dc53b</w:t>
-        <w:br/>
-      </w:r>
-      <w:r>
-        <w:rPr>
-          <w:rFonts w:ascii="Courier New" w:hAnsi="Courier New"/>
-          <w:color w:val="222222"/>
-          <w:sz w:val="17"/>
-        </w:rPr>
-        <w:br/>
-      </w:r>
-      <w:r>
-        <w:rPr>
-          <w:rFonts w:ascii="Courier New" w:hAnsi="Courier New"/>
-          <w:color w:val="222222"/>
-          <w:sz w:val="17"/>
-        </w:rPr>
-        <w:br/>
-      </w:r>
-      <w:r>
-        <w:rPr>
-          <w:rFonts w:ascii="Courier New" w:hAnsi="Courier New"/>
-          <w:color w:val="222222"/>
-          <w:sz w:val="17"/>
-        </w:rPr>
-        <w:br/>
-      </w:r>
-      <w:r>
-        <w:rPr>
-          <w:rFonts w:ascii="Courier New" w:hAnsi="Courier New"/>
-          <w:color w:val="222222"/>
-          <w:sz w:val="17"/>
-        </w:rPr>
-        <w:t>=== 9. GET /api/equipment/4 after delete -&gt; 404 Not Found ===</w:t>
-        <w:br/>
-      </w:r>
-      <w:r>
-        <w:rPr>
-          <w:rFonts w:ascii="Courier New" w:hAnsi="Courier New"/>
-          <w:color w:val="222222"/>
-          <w:sz w:val="17"/>
-        </w:rPr>
-        <w:t>HTTP/1.1 404 Not Found</w:t>
-        <w:br/>
-      </w:r>
-      <w:r>
-        <w:rPr>
-          <w:rFonts w:ascii="Courier New" w:hAnsi="Courier New"/>
-          <w:color w:val="222222"/>
-          <w:sz w:val="17"/>
-        </w:rPr>
-        <w:t>X-Correlation-Id: ee53a1fd-393b-4362-9dbc-1165883acdb9</w:t>
-        <w:br/>
-      </w:r>
-      <w:r>
-        <w:rPr>
-          <w:rFonts w:ascii="Courier New" w:hAnsi="Courier New"/>
-          <w:color w:val="222222"/>
-          <w:sz w:val="17"/>
-        </w:rPr>
-        <w:br/>
-      </w:r>
-      <w:r>
-        <w:rPr>
-          <w:rFonts w:ascii="Courier New" w:hAnsi="Courier New"/>
-          <w:color w:val="222222"/>
-          <w:sz w:val="17"/>
-        </w:rPr>
-        <w:t>{"timestamp":"2026-07-30T17:42:43.827709Z","status":404,"error":"Equipment 4 not found"}</w:t>
-      </w:r>
-    </w:p>
-    <w:p>
-      <w:pPr>
-        <w:pStyle w:val="Heading2"/>
-      </w:pPr>
-      <w:r>
-        <w:t>Gateway, Service Discovery and Configuration</w:t>
-      </w:r>
-    </w:p>
-    <w:p>
-      <w:r>
-        <w:t>All three application services (API-GATEWAY, BOOKING-SERVICE, EQUIPMENT-SERVICE) are shown below registered and UP in the Eureka dashboard. Corresponding screencast timestamp: MM:SS-MM:SS (TBD).</w:t>
-      </w:r>
-    </w:p>
-    <w:p>
-      <w:pPr>
         <w:jc w:val="center"/>
       </w:pPr>
       <w:r>
         <w:drawing>
           <wp:inline xmlns:a="http://schemas.openxmlformats.org/drawingml/2006/main" xmlns:pic="http://schemas.openxmlformats.org/drawingml/2006/picture">
-            <wp:extent cx="5760720" cy="2887727"/>
+            <wp:extent cx="5760720" cy="3112245"/>
             <wp:docPr id="2" name="Picture 2"/>
             <wp:cNvGraphicFramePr>
               <a:graphicFrameLocks noChangeAspect="1"/>
@@ -716,7 +446,7 @@
               <a:graphicData uri="http://schemas.openxmlformats.org/drawingml/2006/picture">
                 <pic:pic>
                   <pic:nvPicPr>
-                    <pic:cNvPr id="0" name="01-eureka-registered-services.jpg"/>
+                    <pic:cNvPr id="0" name="09-crud-security-part1.jpg"/>
                     <pic:cNvPicPr/>
                   </pic:nvPicPr>
                   <pic:blipFill>
@@ -728,7 +458,7 @@
                   <pic:spPr>
                     <a:xfrm>
                       <a:off x="0" y="0"/>
-                      <a:ext cx="5760720" cy="2887727"/>
+                      <a:ext cx="5760720" cy="3112245"/>
                     </a:xfrm>
                     <a:prstGeom prst="rect"/>
                   </pic:spPr>
@@ -748,958 +478,17 @@
           <w:i/>
           <w:sz w:val="19"/>
         </w:rPr>
-        <w:t>Figure 2: Eureka dashboard — all three services registered and UP</w:t>
+        <w:t>Figure 2: Login, 401, 403, CREATE, and READ</w:t>
       </w:r>
     </w:p>
     <w:p>
-      <w:r>
-        <w:t>Configuration is fetched from the Config Server at boot; the dev profile serves H2 datasource settings and DEBUG-level logging, the prod profile serves PostgreSQL settings sourced from environment variables and WARN-level logging (see config-server/src/main/resources/config/booking-service-dev.yml vs booking-service-prod.yml).</w:t>
-      </w:r>
-    </w:p>
-    <w:p>
-      <w:pPr>
-        <w:pStyle w:val="Heading2"/>
-      </w:pPr>
-      <w:r>
-        <w:t>Security</w:t>
-      </w:r>
-    </w:p>
-    <w:p>
-      <w:r>
-        <w:t>The transcript below shows a successful login issuing a JWT, an unauthenticated request rejected with 401 directly by the Gateway (before reaching any domain service), and a request rejected with 403 for a correctly-authenticated USER attempting an ADMIN-only write. Corresponding screencast timestamp: MM:SS-MM:SS (TBD).</w:t>
-      </w:r>
-    </w:p>
-    <w:p>
-      <w:pPr>
-        <w:spacing w:before="40" w:after="160"/>
-        <w:ind w:left="216"/>
-        <w:shd w:fill="F3F4F6"/>
-      </w:pPr>
-      <w:r>
-        <w:rPr>
-          <w:rFonts w:ascii="Courier New" w:hAnsi="Courier New"/>
-          <w:color w:val="222222"/>
-          <w:sz w:val="17"/>
-        </w:rPr>
-        <w:t>=== 1. POST /api/auth/login (admin) - 200 ===</w:t>
-        <w:br/>
-      </w:r>
-      <w:r>
-        <w:rPr>
-          <w:rFonts w:ascii="Courier New" w:hAnsi="Courier New"/>
-          <w:color w:val="222222"/>
-          <w:sz w:val="17"/>
-        </w:rPr>
-        <w:t>HTTP/1.1 200 OK</w:t>
-        <w:br/>
-      </w:r>
-      <w:r>
-        <w:rPr>
-          <w:rFonts w:ascii="Courier New" w:hAnsi="Courier New"/>
-          <w:color w:val="222222"/>
-          <w:sz w:val="17"/>
-        </w:rPr>
-        <w:t>X-Correlation-Id: c5e97bdd-7175-4b5f-953c-192fdf3d4452</w:t>
-        <w:br/>
-      </w:r>
-      <w:r>
-        <w:rPr>
-          <w:rFonts w:ascii="Courier New" w:hAnsi="Courier New"/>
-          <w:color w:val="222222"/>
-          <w:sz w:val="17"/>
-        </w:rPr>
-        <w:br/>
-      </w:r>
-      <w:r>
-        <w:rPr>
-          <w:rFonts w:ascii="Courier New" w:hAnsi="Courier New"/>
-          <w:color w:val="222222"/>
-          <w:sz w:val="17"/>
-        </w:rPr>
-        <w:t>{"token":"eyJhbGciOiJIUzM4NCJ9...(truncated)...CLR7jgxPodCS1nuNTz2Zqwt","username":"admin","role":"ADMIN","expiresInMs":3600000}</w:t>
-        <w:br/>
-      </w:r>
-      <w:r>
-        <w:rPr>
-          <w:rFonts w:ascii="Courier New" w:hAnsi="Courier New"/>
-          <w:color w:val="222222"/>
-          <w:sz w:val="17"/>
-        </w:rPr>
-        <w:br/>
-      </w:r>
-      <w:r>
-        <w:rPr>
-          <w:rFonts w:ascii="Courier New" w:hAnsi="Courier New"/>
-          <w:color w:val="222222"/>
-          <w:sz w:val="17"/>
-        </w:rPr>
-        <w:t>=== 2. GET /api/equipment with NO token -&gt; 401 ===</w:t>
-        <w:br/>
-      </w:r>
-      <w:r>
-        <w:rPr>
-          <w:rFonts w:ascii="Courier New" w:hAnsi="Courier New"/>
-          <w:color w:val="222222"/>
-          <w:sz w:val="17"/>
-        </w:rPr>
-        <w:t>HTTP/1.1 401 Unauthorized</w:t>
-        <w:br/>
-      </w:r>
-      <w:r>
-        <w:rPr>
-          <w:rFonts w:ascii="Courier New" w:hAnsi="Courier New"/>
-          <w:color w:val="222222"/>
-          <w:sz w:val="17"/>
-        </w:rPr>
-        <w:t>X-Auth-Error: Missing bearer token</w:t>
-        <w:br/>
-      </w:r>
-      <w:r>
-        <w:rPr>
-          <w:rFonts w:ascii="Courier New" w:hAnsi="Courier New"/>
-          <w:color w:val="222222"/>
-          <w:sz w:val="17"/>
-        </w:rPr>
-        <w:br/>
-      </w:r>
-      <w:r>
-        <w:rPr>
-          <w:rFonts w:ascii="Courier New" w:hAnsi="Courier New"/>
-          <w:color w:val="222222"/>
-          <w:sz w:val="17"/>
-        </w:rPr>
-        <w:br/>
-      </w:r>
-      <w:r>
-        <w:rPr>
-          <w:rFonts w:ascii="Courier New" w:hAnsi="Courier New"/>
-          <w:color w:val="222222"/>
-          <w:sz w:val="17"/>
-        </w:rPr>
-        <w:br/>
-      </w:r>
-      <w:r>
-        <w:rPr>
-          <w:rFonts w:ascii="Courier New" w:hAnsi="Courier New"/>
-          <w:color w:val="222222"/>
-          <w:sz w:val="17"/>
-        </w:rPr>
-        <w:t>=== 3. POST /api/equipment as STUDENT (wrong role) -&gt; 403 ===</w:t>
-        <w:br/>
-      </w:r>
-      <w:r>
-        <w:rPr>
-          <w:rFonts w:ascii="Courier New" w:hAnsi="Courier New"/>
-          <w:color w:val="222222"/>
-          <w:sz w:val="17"/>
-        </w:rPr>
-        <w:t>HTTP/1.1 403 Forbidden</w:t>
-        <w:br/>
-      </w:r>
-      <w:r>
-        <w:rPr>
-          <w:rFonts w:ascii="Courier New" w:hAnsi="Courier New"/>
-          <w:color w:val="222222"/>
-          <w:sz w:val="17"/>
-        </w:rPr>
-        <w:t>X-Correlation-Id: 5e85ea9c-54eb-4011-8bdf-ca81e0154cd2</w:t>
-        <w:br/>
-      </w:r>
-      <w:r>
-        <w:rPr>
-          <w:rFonts w:ascii="Courier New" w:hAnsi="Courier New"/>
-          <w:color w:val="222222"/>
-          <w:sz w:val="17"/>
-        </w:rPr>
-        <w:br/>
-      </w:r>
-      <w:r>
-        <w:rPr>
-          <w:rFonts w:ascii="Courier New" w:hAnsi="Courier New"/>
-          <w:color w:val="222222"/>
-          <w:sz w:val="17"/>
-        </w:rPr>
-        <w:t>{"timestamp":"2026-07-30T17:42:25.643544Z","status":403,"error":"Requires role: ADMIN"}</w:t>
-        <w:br/>
-      </w:r>
-      <w:r>
-        <w:rPr>
-          <w:rFonts w:ascii="Courier New" w:hAnsi="Courier New"/>
-          <w:color w:val="222222"/>
-          <w:sz w:val="17"/>
-        </w:rPr>
-        <w:br/>
-      </w:r>
-      <w:r>
-        <w:rPr>
-          <w:rFonts w:ascii="Courier New" w:hAnsi="Courier New"/>
-          <w:color w:val="222222"/>
-          <w:sz w:val="17"/>
-        </w:rPr>
-        <w:t>=== 4. POST /api/equipment as ADMIN -&gt; 201 Created (CREATE) ===</w:t>
-        <w:br/>
-      </w:r>
-      <w:r>
-        <w:rPr>
-          <w:rFonts w:ascii="Courier New" w:hAnsi="Courier New"/>
-          <w:color w:val="222222"/>
-          <w:sz w:val="17"/>
-        </w:rPr>
-        <w:t>HTTP/1.1 201 Created</w:t>
-        <w:br/>
-      </w:r>
-      <w:r>
-        <w:rPr>
-          <w:rFonts w:ascii="Courier New" w:hAnsi="Courier New"/>
-          <w:color w:val="222222"/>
-          <w:sz w:val="17"/>
-        </w:rPr>
-        <w:t>X-Correlation-Id: 7aec9f0a-c210-445d-80a8-e346fd0d6f74</w:t>
-        <w:br/>
-      </w:r>
-      <w:r>
-        <w:rPr>
-          <w:rFonts w:ascii="Courier New" w:hAnsi="Courier New"/>
-          <w:color w:val="222222"/>
-          <w:sz w:val="17"/>
-        </w:rPr>
-        <w:t>Location: /api/equipment/4</w:t>
-        <w:br/>
-      </w:r>
-      <w:r>
-        <w:rPr>
-          <w:rFonts w:ascii="Courier New" w:hAnsi="Courier New"/>
-          <w:color w:val="222222"/>
-          <w:sz w:val="17"/>
-        </w:rPr>
-        <w:br/>
-      </w:r>
-      <w:r>
-        <w:rPr>
-          <w:rFonts w:ascii="Courier New" w:hAnsi="Courier New"/>
-          <w:color w:val="222222"/>
-          <w:sz w:val="17"/>
-        </w:rPr>
-        <w:t>{"id":4,"name":"3D Printer","category":"Fabrication","location":"Lab C","status":"AVAILABLE","conditionNotes":"New","createdAt":"2026-07-30T17:42:25.725888Z","updatedAt":"2026-07-30T17:42:25.725888Z"}</w:t>
-      </w:r>
-    </w:p>
-    <w:p>
-      <w:pPr>
-        <w:pStyle w:val="Heading2"/>
-      </w:pPr>
-      <w:r>
-        <w:t>Service-to-Service Communication and Resilience</w:t>
-      </w:r>
-    </w:p>
-    <w:p>
-      <w:r>
-        <w:t>Equipment Service was stopped to simulate an outage. The circuit breaker's state was queried before and after repeated failing calls, showing the transition CLOSED → OPEN (actual failure rate 80%, exceeding the 50% threshold) → automatic HALF_OPEN after the configured wait duration. While OPEN, calls fail immediately without attempting the network call (notPermittedCalls), and the caller receives a clear 503 in roughly a second rather than a hang. Corresponding screencast timestamp: MM:SS-MM:SS (TBD).</w:t>
-      </w:r>
-    </w:p>
-    <w:p>
-      <w:pPr>
-        <w:spacing w:before="40" w:after="160"/>
-        <w:ind w:left="216"/>
-        <w:shd w:fill="F3F4F6"/>
-      </w:pPr>
-      <w:r>
-        <w:rPr>
-          <w:rFonts w:ascii="Courier New" w:hAnsi="Courier New"/>
-          <w:color w:val="222222"/>
-          <w:sz w:val="17"/>
-        </w:rPr>
-        <w:t>=== Booking Service circuit breaker state BEFORE failure (CLOSED) ===</w:t>
-        <w:br/>
-      </w:r>
-      <w:r>
-        <w:rPr>
-          <w:rFonts w:ascii="Courier New" w:hAnsi="Courier New"/>
-          <w:color w:val="222222"/>
-          <w:sz w:val="17"/>
-        </w:rPr>
-        <w:t>{</w:t>
-        <w:br/>
-      </w:r>
-      <w:r>
-        <w:rPr>
-          <w:rFonts w:ascii="Courier New" w:hAnsi="Courier New"/>
-          <w:color w:val="222222"/>
-          <w:sz w:val="17"/>
-        </w:rPr>
-        <w:t xml:space="preserve">  "details": {</w:t>
-        <w:br/>
-      </w:r>
-      <w:r>
-        <w:rPr>
-          <w:rFonts w:ascii="Courier New" w:hAnsi="Courier New"/>
-          <w:color w:val="222222"/>
-          <w:sz w:val="17"/>
-        </w:rPr>
-        <w:t xml:space="preserve">    "equipmentService": {</w:t>
-        <w:br/>
-      </w:r>
-      <w:r>
-        <w:rPr>
-          <w:rFonts w:ascii="Courier New" w:hAnsi="Courier New"/>
-          <w:color w:val="222222"/>
-          <w:sz w:val="17"/>
-        </w:rPr>
-        <w:t xml:space="preserve">      "details": {</w:t>
-        <w:br/>
-      </w:r>
-      <w:r>
-        <w:rPr>
-          <w:rFonts w:ascii="Courier New" w:hAnsi="Courier New"/>
-          <w:color w:val="222222"/>
-          <w:sz w:val="17"/>
-        </w:rPr>
-        <w:t xml:space="preserve">        "failureRate": "-1.0%",</w:t>
-        <w:br/>
-      </w:r>
-      <w:r>
-        <w:rPr>
-          <w:rFonts w:ascii="Courier New" w:hAnsi="Courier New"/>
-          <w:color w:val="222222"/>
-          <w:sz w:val="17"/>
-        </w:rPr>
-        <w:t xml:space="preserve">        "failureRateThreshold": "50.0%",</w:t>
-        <w:br/>
-      </w:r>
-      <w:r>
-        <w:rPr>
-          <w:rFonts w:ascii="Courier New" w:hAnsi="Courier New"/>
-          <w:color w:val="222222"/>
-          <w:sz w:val="17"/>
-        </w:rPr>
-        <w:t xml:space="preserve">        "slowCallRate": "-1.0%",</w:t>
-        <w:br/>
-      </w:r>
-      <w:r>
-        <w:rPr>
-          <w:rFonts w:ascii="Courier New" w:hAnsi="Courier New"/>
-          <w:color w:val="222222"/>
-          <w:sz w:val="17"/>
-        </w:rPr>
-        <w:t xml:space="preserve">        "slowCallRateThreshold": "100.0%",</w:t>
-        <w:br/>
-      </w:r>
-      <w:r>
-        <w:rPr>
-          <w:rFonts w:ascii="Courier New" w:hAnsi="Courier New"/>
-          <w:color w:val="222222"/>
-          <w:sz w:val="17"/>
-        </w:rPr>
-        <w:t xml:space="preserve">        "bufferedCalls": 1,</w:t>
-        <w:br/>
-      </w:r>
-      <w:r>
-        <w:rPr>
-          <w:rFonts w:ascii="Courier New" w:hAnsi="Courier New"/>
-          <w:color w:val="222222"/>
-          <w:sz w:val="17"/>
-        </w:rPr>
-        <w:t xml:space="preserve">        "slowCalls": 0,</w:t>
-        <w:br/>
-      </w:r>
-      <w:r>
-        <w:rPr>
-          <w:rFonts w:ascii="Courier New" w:hAnsi="Courier New"/>
-          <w:color w:val="222222"/>
-          <w:sz w:val="17"/>
-        </w:rPr>
-        <w:t xml:space="preserve">        "slowFailedCalls": 0,</w:t>
-        <w:br/>
-      </w:r>
-      <w:r>
-        <w:rPr>
-          <w:rFonts w:ascii="Courier New" w:hAnsi="Courier New"/>
-          <w:color w:val="222222"/>
-          <w:sz w:val="17"/>
-        </w:rPr>
-        <w:t xml:space="preserve">        "failedCalls": 0,</w:t>
-        <w:br/>
-      </w:r>
-      <w:r>
-        <w:rPr>
-          <w:rFonts w:ascii="Courier New" w:hAnsi="Courier New"/>
-          <w:color w:val="222222"/>
-          <w:sz w:val="17"/>
-        </w:rPr>
-        <w:t xml:space="preserve">        "notPermittedCalls": 0,</w:t>
-        <w:br/>
-      </w:r>
-      <w:r>
-        <w:rPr>
-          <w:rFonts w:ascii="Courier New" w:hAnsi="Courier New"/>
-          <w:color w:val="222222"/>
-          <w:sz w:val="17"/>
-        </w:rPr>
-        <w:t xml:space="preserve">        "state": "CLOSED"</w:t>
-        <w:br/>
-      </w:r>
-      <w:r>
-        <w:rPr>
-          <w:rFonts w:ascii="Courier New" w:hAnsi="Courier New"/>
-          <w:color w:val="222222"/>
-          <w:sz w:val="17"/>
-        </w:rPr>
-        <w:t xml:space="preserve">      },</w:t>
-        <w:br/>
-      </w:r>
-      <w:r>
-        <w:rPr>
-          <w:rFonts w:ascii="Courier New" w:hAnsi="Courier New"/>
-          <w:color w:val="222222"/>
-          <w:sz w:val="17"/>
-        </w:rPr>
-        <w:t xml:space="preserve">      "status": "UP"</w:t>
-        <w:br/>
-      </w:r>
-      <w:r>
-        <w:rPr>
-          <w:rFonts w:ascii="Courier New" w:hAnsi="Courier New"/>
-          <w:color w:val="222222"/>
-          <w:sz w:val="17"/>
-        </w:rPr>
-        <w:t xml:space="preserve">    }</w:t>
-        <w:br/>
-      </w:r>
-      <w:r>
-        <w:rPr>
-          <w:rFonts w:ascii="Courier New" w:hAnsi="Courier New"/>
-          <w:color w:val="222222"/>
-          <w:sz w:val="17"/>
-        </w:rPr>
-        <w:t xml:space="preserve">  },</w:t>
-        <w:br/>
-      </w:r>
-      <w:r>
-        <w:rPr>
-          <w:rFonts w:ascii="Courier New" w:hAnsi="Courier New"/>
-          <w:color w:val="222222"/>
-          <w:sz w:val="17"/>
-        </w:rPr>
-        <w:t xml:space="preserve">  "status": "UP"</w:t>
-        <w:br/>
-      </w:r>
-      <w:r>
-        <w:rPr>
-          <w:rFonts w:ascii="Courier New" w:hAnsi="Courier New"/>
-          <w:color w:val="222222"/>
-          <w:sz w:val="17"/>
-        </w:rPr>
-        <w:t>}</w:t>
-        <w:br/>
-      </w:r>
-      <w:r>
-        <w:rPr>
-          <w:rFonts w:ascii="Courier New" w:hAnsi="Courier New"/>
-          <w:color w:val="222222"/>
-          <w:sz w:val="17"/>
-        </w:rPr>
-        <w:br/>
-      </w:r>
-      <w:r>
-        <w:rPr>
-          <w:rFonts w:ascii="Courier New" w:hAnsi="Courier New"/>
-          <w:color w:val="222222"/>
-          <w:sz w:val="17"/>
-        </w:rPr>
-        <w:t>=== Killing equipment-service to simulate an outage ===</w:t>
-        <w:br/>
-      </w:r>
-      <w:r>
-        <w:rPr>
-          <w:rFonts w:ascii="Courier New" w:hAnsi="Courier New"/>
-          <w:color w:val="222222"/>
-          <w:sz w:val="17"/>
-        </w:rPr>
-        <w:t>=== POST /api/bookings while Equipment Service is DOWN ===</w:t>
-        <w:br/>
-      </w:r>
-      <w:r>
-        <w:rPr>
-          <w:rFonts w:ascii="Courier New" w:hAnsi="Courier New"/>
-          <w:color w:val="222222"/>
-          <w:sz w:val="17"/>
-        </w:rPr>
-        <w:t>HTTP/1.1 503 Service Unavailable</w:t>
-        <w:br/>
-      </w:r>
-      <w:r>
-        <w:rPr>
-          <w:rFonts w:ascii="Courier New" w:hAnsi="Courier New"/>
-          <w:color w:val="222222"/>
-          <w:sz w:val="17"/>
-        </w:rPr>
-        <w:t>X-Correlation-Id: 291756ba-ba0c-41fa-bf9b-78a5d65eae3a</w:t>
-        <w:br/>
-      </w:r>
-      <w:r>
-        <w:rPr>
-          <w:rFonts w:ascii="Courier New" w:hAnsi="Courier New"/>
-          <w:color w:val="222222"/>
-          <w:sz w:val="17"/>
-        </w:rPr>
-        <w:br/>
-      </w:r>
-      <w:r>
-        <w:rPr>
-          <w:rFonts w:ascii="Courier New" w:hAnsi="Courier New"/>
-          <w:color w:val="222222"/>
-          <w:sz w:val="17"/>
-        </w:rPr>
-        <w:t>{"timestamp":"2026-07-30T17:43:14.309783Z","status":503,"error":"Equipment Service is currently unavailable - could not verify equipment 1. Please try again shortly."}</w:t>
-        <w:br/>
-      </w:r>
-      <w:r>
-        <w:rPr>
-          <w:rFonts w:ascii="Courier New" w:hAnsi="Courier New"/>
-          <w:color w:val="222222"/>
-          <w:sz w:val="17"/>
-        </w:rPr>
-        <w:br/>
-      </w:r>
-      <w:r>
-        <w:rPr>
-          <w:rFonts w:ascii="Courier New" w:hAnsi="Courier New"/>
-          <w:color w:val="222222"/>
-          <w:sz w:val="17"/>
-        </w:rPr>
-        <w:t>(request completed in ~1.3s total - fast, clear failure rather than a hang)</w:t>
-        <w:br/>
-      </w:r>
-      <w:r>
-        <w:rPr>
-          <w:rFonts w:ascii="Courier New" w:hAnsi="Courier New"/>
-          <w:color w:val="222222"/>
-          <w:sz w:val="17"/>
-        </w:rPr>
-        <w:br/>
-      </w:r>
-      <w:r>
-        <w:rPr>
-          <w:rFonts w:ascii="Courier New" w:hAnsi="Courier New"/>
-          <w:color w:val="222222"/>
-          <w:sz w:val="17"/>
-        </w:rPr>
-        <w:t>=== 6 rapid attempts while Equipment Service down -&gt; all 503, circuit breaker trips OPEN ===</w:t>
-        <w:br/>
-      </w:r>
-      <w:r>
-        <w:rPr>
-          <w:rFonts w:ascii="Courier New" w:hAnsi="Courier New"/>
-          <w:color w:val="222222"/>
-          <w:sz w:val="17"/>
-        </w:rPr>
-        <w:t>attempt 1: 503</w:t>
-        <w:br/>
-      </w:r>
-      <w:r>
-        <w:rPr>
-          <w:rFonts w:ascii="Courier New" w:hAnsi="Courier New"/>
-          <w:color w:val="222222"/>
-          <w:sz w:val="17"/>
-        </w:rPr>
-        <w:t>attempt 2: 503</w:t>
-        <w:br/>
-      </w:r>
-      <w:r>
-        <w:rPr>
-          <w:rFonts w:ascii="Courier New" w:hAnsi="Courier New"/>
-          <w:color w:val="222222"/>
-          <w:sz w:val="17"/>
-        </w:rPr>
-        <w:t>attempt 3: 503</w:t>
-        <w:br/>
-      </w:r>
-      <w:r>
-        <w:rPr>
-          <w:rFonts w:ascii="Courier New" w:hAnsi="Courier New"/>
-          <w:color w:val="222222"/>
-          <w:sz w:val="17"/>
-        </w:rPr>
-        <w:t>attempt 4: 503</w:t>
-        <w:br/>
-      </w:r>
-      <w:r>
-        <w:rPr>
-          <w:rFonts w:ascii="Courier New" w:hAnsi="Courier New"/>
-          <w:color w:val="222222"/>
-          <w:sz w:val="17"/>
-        </w:rPr>
-        <w:t>attempt 5: 503</w:t>
-        <w:br/>
-      </w:r>
-      <w:r>
-        <w:rPr>
-          <w:rFonts w:ascii="Courier New" w:hAnsi="Courier New"/>
-          <w:color w:val="222222"/>
-          <w:sz w:val="17"/>
-        </w:rPr>
-        <w:t>attempt 6: 503</w:t>
-        <w:br/>
-      </w:r>
-      <w:r>
-        <w:rPr>
-          <w:rFonts w:ascii="Courier New" w:hAnsi="Courier New"/>
-          <w:color w:val="222222"/>
-          <w:sz w:val="17"/>
-        </w:rPr>
-        <w:br/>
-      </w:r>
-      <w:r>
-        <w:rPr>
-          <w:rFonts w:ascii="Courier New" w:hAnsi="Courier New"/>
-          <w:color w:val="222222"/>
-          <w:sz w:val="17"/>
-        </w:rPr>
-        <w:t>=== Circuit breaker state AFTER repeated failures (OPEN - fails fast, no network call attempted) ===</w:t>
-        <w:br/>
-      </w:r>
-      <w:r>
-        <w:rPr>
-          <w:rFonts w:ascii="Courier New" w:hAnsi="Courier New"/>
-          <w:color w:val="222222"/>
-          <w:sz w:val="17"/>
-        </w:rPr>
-        <w:t>{</w:t>
-        <w:br/>
-      </w:r>
-      <w:r>
-        <w:rPr>
-          <w:rFonts w:ascii="Courier New" w:hAnsi="Courier New"/>
-          <w:color w:val="222222"/>
-          <w:sz w:val="17"/>
-        </w:rPr>
-        <w:t xml:space="preserve">  "details": {</w:t>
-        <w:br/>
-      </w:r>
-      <w:r>
-        <w:rPr>
-          <w:rFonts w:ascii="Courier New" w:hAnsi="Courier New"/>
-          <w:color w:val="222222"/>
-          <w:sz w:val="17"/>
-        </w:rPr>
-        <w:t xml:space="preserve">    "equipmentService": {</w:t>
-        <w:br/>
-      </w:r>
-      <w:r>
-        <w:rPr>
-          <w:rFonts w:ascii="Courier New" w:hAnsi="Courier New"/>
-          <w:color w:val="222222"/>
-          <w:sz w:val="17"/>
-        </w:rPr>
-        <w:t xml:space="preserve">      "details": {</w:t>
-        <w:br/>
-      </w:r>
-      <w:r>
-        <w:rPr>
-          <w:rFonts w:ascii="Courier New" w:hAnsi="Courier New"/>
-          <w:color w:val="222222"/>
-          <w:sz w:val="17"/>
-        </w:rPr>
-        <w:t xml:space="preserve">        "failureRate": "80.0%",</w:t>
-        <w:br/>
-      </w:r>
-      <w:r>
-        <w:rPr>
-          <w:rFonts w:ascii="Courier New" w:hAnsi="Courier New"/>
-          <w:color w:val="222222"/>
-          <w:sz w:val="17"/>
-        </w:rPr>
-        <w:t xml:space="preserve">        "failureRateThreshold": "50.0%",</w:t>
-        <w:br/>
-      </w:r>
-      <w:r>
-        <w:rPr>
-          <w:rFonts w:ascii="Courier New" w:hAnsi="Courier New"/>
-          <w:color w:val="222222"/>
-          <w:sz w:val="17"/>
-        </w:rPr>
-        <w:t xml:space="preserve">        "slowCallRate": "0.0%",</w:t>
-        <w:br/>
-      </w:r>
-      <w:r>
-        <w:rPr>
-          <w:rFonts w:ascii="Courier New" w:hAnsi="Courier New"/>
-          <w:color w:val="222222"/>
-          <w:sz w:val="17"/>
-        </w:rPr>
-        <w:t xml:space="preserve">        "slowCallRateThreshold": "100.0%",</w:t>
-        <w:br/>
-      </w:r>
-      <w:r>
-        <w:rPr>
-          <w:rFonts w:ascii="Courier New" w:hAnsi="Courier New"/>
-          <w:color w:val="222222"/>
-          <w:sz w:val="17"/>
-        </w:rPr>
-        <w:t xml:space="preserve">        "bufferedCalls": 5,</w:t>
-        <w:br/>
-      </w:r>
-      <w:r>
-        <w:rPr>
-          <w:rFonts w:ascii="Courier New" w:hAnsi="Courier New"/>
-          <w:color w:val="222222"/>
-          <w:sz w:val="17"/>
-        </w:rPr>
-        <w:t xml:space="preserve">        "slowCalls": 0,</w:t>
-        <w:br/>
-      </w:r>
-      <w:r>
-        <w:rPr>
-          <w:rFonts w:ascii="Courier New" w:hAnsi="Courier New"/>
-          <w:color w:val="222222"/>
-          <w:sz w:val="17"/>
-        </w:rPr>
-        <w:t xml:space="preserve">        "slowFailedCalls": 0,</w:t>
-        <w:br/>
-      </w:r>
-      <w:r>
-        <w:rPr>
-          <w:rFonts w:ascii="Courier New" w:hAnsi="Courier New"/>
-          <w:color w:val="222222"/>
-          <w:sz w:val="17"/>
-        </w:rPr>
-        <w:t xml:space="preserve">        "failedCalls": 4,</w:t>
-        <w:br/>
-      </w:r>
-      <w:r>
-        <w:rPr>
-          <w:rFonts w:ascii="Courier New" w:hAnsi="Courier New"/>
-          <w:color w:val="222222"/>
-          <w:sz w:val="17"/>
-        </w:rPr>
-        <w:t xml:space="preserve">        "notPermittedCalls": 17,</w:t>
-        <w:br/>
-      </w:r>
-      <w:r>
-        <w:rPr>
-          <w:rFonts w:ascii="Courier New" w:hAnsi="Courier New"/>
-          <w:color w:val="222222"/>
-          <w:sz w:val="17"/>
-        </w:rPr>
-        <w:t xml:space="preserve">        "state": "OPEN"</w:t>
-        <w:br/>
-      </w:r>
-      <w:r>
-        <w:rPr>
-          <w:rFonts w:ascii="Courier New" w:hAnsi="Courier New"/>
-          <w:color w:val="222222"/>
-          <w:sz w:val="17"/>
-        </w:rPr>
-        <w:t xml:space="preserve">      },</w:t>
-        <w:br/>
-      </w:r>
-      <w:r>
-        <w:rPr>
-          <w:rFonts w:ascii="Courier New" w:hAnsi="Courier New"/>
-          <w:color w:val="222222"/>
-          <w:sz w:val="17"/>
-        </w:rPr>
-        <w:t xml:space="preserve">      "status": "CIRCUIT_OPEN"</w:t>
-        <w:br/>
-      </w:r>
-      <w:r>
-        <w:rPr>
-          <w:rFonts w:ascii="Courier New" w:hAnsi="Courier New"/>
-          <w:color w:val="222222"/>
-          <w:sz w:val="17"/>
-        </w:rPr>
-        <w:t xml:space="preserve">    }</w:t>
-        <w:br/>
-      </w:r>
-      <w:r>
-        <w:rPr>
-          <w:rFonts w:ascii="Courier New" w:hAnsi="Courier New"/>
-          <w:color w:val="222222"/>
-          <w:sz w:val="17"/>
-        </w:rPr>
-        <w:t xml:space="preserve">  },</w:t>
-        <w:br/>
-      </w:r>
-      <w:r>
-        <w:rPr>
-          <w:rFonts w:ascii="Courier New" w:hAnsi="Courier New"/>
-          <w:color w:val="222222"/>
-          <w:sz w:val="17"/>
-        </w:rPr>
-        <w:t xml:space="preserve">  "status": "UNKNOWN"</w:t>
-        <w:br/>
-      </w:r>
-      <w:r>
-        <w:rPr>
-          <w:rFonts w:ascii="Courier New" w:hAnsi="Courier New"/>
-          <w:color w:val="222222"/>
-          <w:sz w:val="17"/>
-        </w:rPr>
-        <w:t>}</w:t>
-        <w:br/>
-      </w:r>
-      <w:r>
-        <w:rPr>
-          <w:rFonts w:ascii="Courier New" w:hAnsi="Courier New"/>
-          <w:color w:val="222222"/>
-          <w:sz w:val="17"/>
-        </w:rPr>
-        <w:br/>
-      </w:r>
-      <w:r>
-        <w:rPr>
-          <w:rFonts w:ascii="Courier New" w:hAnsi="Courier New"/>
-          <w:color w:val="222222"/>
-          <w:sz w:val="17"/>
-        </w:rPr>
-        <w:t>Note: failureRateThreshold (50%) was exceeded (80% actual), so the breaker opened after the</w:t>
-        <w:br/>
-      </w:r>
-      <w:r>
-        <w:rPr>
-          <w:rFonts w:ascii="Courier New" w:hAnsi="Courier New"/>
-          <w:color w:val="222222"/>
-          <w:sz w:val="17"/>
-        </w:rPr>
-        <w:t>minimum-number-of-calls (5) threshold was reached. notPermittedCalls=17 shows the breaker then</w:t>
-        <w:br/>
-      </w:r>
-      <w:r>
-        <w:rPr>
-          <w:rFonts w:ascii="Courier New" w:hAnsi="Courier New"/>
-          <w:color w:val="222222"/>
-          <w:sz w:val="17"/>
-        </w:rPr>
-        <w:t>started rejecting calls immediately (no network attempt) while OPEN. After wait-duration-in-open-state</w:t>
-        <w:br/>
-      </w:r>
-      <w:r>
-        <w:rPr>
-          <w:rFonts w:ascii="Courier New" w:hAnsi="Courier New"/>
-          <w:color w:val="222222"/>
-          <w:sz w:val="17"/>
-        </w:rPr>
-        <w:t>(10s), it automatically transitioned to HALF_OPEN to test recovery - confirmed by a follow-up query:</w:t>
-        <w:br/>
-      </w:r>
-      <w:r>
-        <w:rPr>
-          <w:rFonts w:ascii="Courier New" w:hAnsi="Courier New"/>
-          <w:color w:val="222222"/>
-          <w:sz w:val="17"/>
-        </w:rPr>
-        <w:br/>
-      </w:r>
-      <w:r>
-        <w:rPr>
-          <w:rFonts w:ascii="Courier New" w:hAnsi="Courier New"/>
-          <w:color w:val="222222"/>
-          <w:sz w:val="17"/>
-        </w:rPr>
-        <w:t>{</w:t>
-        <w:br/>
-      </w:r>
-      <w:r>
-        <w:rPr>
-          <w:rFonts w:ascii="Courier New" w:hAnsi="Courier New"/>
-          <w:color w:val="222222"/>
-          <w:sz w:val="17"/>
-        </w:rPr>
-        <w:t xml:space="preserve">  "details": {</w:t>
-        <w:br/>
-      </w:r>
-      <w:r>
-        <w:rPr>
-          <w:rFonts w:ascii="Courier New" w:hAnsi="Courier New"/>
-          <w:color w:val="222222"/>
-          <w:sz w:val="17"/>
-        </w:rPr>
-        <w:t xml:space="preserve">    "equipmentService": {</w:t>
-        <w:br/>
-      </w:r>
-      <w:r>
-        <w:rPr>
-          <w:rFonts w:ascii="Courier New" w:hAnsi="Courier New"/>
-          <w:color w:val="222222"/>
-          <w:sz w:val="17"/>
-        </w:rPr>
-        <w:t xml:space="preserve">      "details": {</w:t>
-        <w:br/>
-      </w:r>
-      <w:r>
-        <w:rPr>
-          <w:rFonts w:ascii="Courier New" w:hAnsi="Courier New"/>
-          <w:color w:val="222222"/>
-          <w:sz w:val="17"/>
-        </w:rPr>
-        <w:t xml:space="preserve">        "state": "HALF_OPEN",</w:t>
-        <w:br/>
-      </w:r>
-      <w:r>
-        <w:rPr>
-          <w:rFonts w:ascii="Courier New" w:hAnsi="Courier New"/>
-          <w:color w:val="222222"/>
-          <w:sz w:val="17"/>
-        </w:rPr>
-        <w:t xml:space="preserve">        "status": "CIRCUIT_HALF_OPEN"</w:t>
-        <w:br/>
-      </w:r>
-      <w:r>
-        <w:rPr>
-          <w:rFonts w:ascii="Courier New" w:hAnsi="Courier New"/>
-          <w:color w:val="222222"/>
-          <w:sz w:val="17"/>
-        </w:rPr>
-        <w:t xml:space="preserve">      }</w:t>
-        <w:br/>
-      </w:r>
-      <w:r>
-        <w:rPr>
-          <w:rFonts w:ascii="Courier New" w:hAnsi="Courier New"/>
-          <w:color w:val="222222"/>
-          <w:sz w:val="17"/>
-        </w:rPr>
-        <w:t xml:space="preserve">    }</w:t>
-        <w:br/>
-      </w:r>
-      <w:r>
-        <w:rPr>
-          <w:rFonts w:ascii="Courier New" w:hAnsi="Courier New"/>
-          <w:color w:val="222222"/>
-          <w:sz w:val="17"/>
-        </w:rPr>
-        <w:t xml:space="preserve">  }</w:t>
-        <w:br/>
-      </w:r>
-      <w:r>
-        <w:rPr>
-          <w:rFonts w:ascii="Courier New" w:hAnsi="Courier New"/>
-          <w:color w:val="222222"/>
-          <w:sz w:val="17"/>
-        </w:rPr>
-        <w:t>}</w:t>
-      </w:r>
-    </w:p>
-    <w:p>
-      <w:pPr>
-        <w:pStyle w:val="Heading2"/>
-      </w:pPr>
-      <w:r>
-        <w:t>Asynchronous Messaging</w:t>
-      </w:r>
-    </w:p>
-    <w:p>
-      <w:r>
-        <w:t>The RabbitMQ management UI below shows the lab-equipment-exchange (topic exchange) and maintenance-requested-queue with live message rates, confirming both are declared correctly and processing traffic. Corresponding screencast timestamp: MM:SS-MM:SS (TBD).</w:t>
-      </w:r>
-    </w:p>
-    <w:p>
       <w:pPr>
         <w:jc w:val="center"/>
       </w:pPr>
       <w:r>
         <w:drawing>
           <wp:inline xmlns:a="http://schemas.openxmlformats.org/drawingml/2006/main" xmlns:pic="http://schemas.openxmlformats.org/drawingml/2006/picture">
-            <wp:extent cx="5760720" cy="2887727"/>
+            <wp:extent cx="5760720" cy="3112245"/>
             <wp:docPr id="3" name="Picture 3"/>
             <wp:cNvGraphicFramePr>
               <a:graphicFrameLocks noChangeAspect="1"/>
@@ -1708,7 +497,7 @@
               <a:graphicData uri="http://schemas.openxmlformats.org/drawingml/2006/picture">
                 <pic:pic>
                   <pic:nvPicPr>
-                    <pic:cNvPr id="0" name="03-rabbitmq-exchange.jpg"/>
+                    <pic:cNvPr id="0" name="10-crud-security-part2.jpg"/>
                     <pic:cNvPicPr/>
                   </pic:nvPicPr>
                   <pic:blipFill>
@@ -1720,7 +509,7 @@
                   <pic:spPr>
                     <a:xfrm>
                       <a:off x="0" y="0"/>
-                      <a:ext cx="5760720" cy="2887727"/>
+                      <a:ext cx="5760720" cy="3112245"/>
                     </a:xfrm>
                     <a:prstGeom prst="rect"/>
                   </pic:spPr>
@@ -1740,7 +529,20 @@
           <w:i/>
           <w:sz w:val="19"/>
         </w:rPr>
-        <w:t>Figure 3: RabbitMQ Exchanges — lab-equipment-exchange with active message rate</w:t>
+        <w:t>Figure 3: READ, UPDATE, validation error (400), DELETE, and 404</w:t>
+      </w:r>
+    </w:p>
+    <w:p>
+      <w:pPr>
+        <w:pStyle w:val="Heading2"/>
+      </w:pPr>
+      <w:r>
+        <w:t>Gateway, Service Discovery and Configuration</w:t>
+      </w:r>
+    </w:p>
+    <w:p>
+      <w:r>
+        <w:t>All three application services (API-GATEWAY, BOOKING-SERVICE, EQUIPMENT-SERVICE) are shown below registered and UP in the Eureka dashboard. Corresponding screencast timestamp: MM:SS-MM:SS (TBD).</w:t>
       </w:r>
     </w:p>
     <w:p>
@@ -1759,7 +561,7 @@
               <a:graphicData uri="http://schemas.openxmlformats.org/drawingml/2006/picture">
                 <pic:pic>
                   <pic:nvPicPr>
-                    <pic:cNvPr id="0" name="02-rabbitmq-queue.jpg"/>
+                    <pic:cNvPr id="0" name="01-eureka-registered-services.jpg"/>
                     <pic:cNvPicPr/>
                   </pic:nvPicPr>
                   <pic:blipFill>
@@ -1791,7 +593,349 @@
           <w:i/>
           <w:sz w:val="19"/>
         </w:rPr>
-        <w:t>Figure 4: RabbitMQ Queues — maintenance-requested-queue</w:t>
+        <w:t>Figure 4: Eureka dashboard — all three services registered and UP</w:t>
+      </w:r>
+    </w:p>
+    <w:p>
+      <w:r>
+        <w:t>Configuration is fetched from the Config Server at boot. The two screenshots below query the same service (booking-service) under the dev and prod profiles directly from the Config Server: dev serves an H2 in-memory datasource with DEBUG-level logging; prod serves a PostgreSQL datasource with credentials as unresolved environment-variable placeholders (${BOOKING_DB_HOST}, ${BOOKING_DB_PASSWORD}, etc. - never hardcoded values) and WARN-level logging. Corresponding screencast timestamp: MM:SS-MM:SS (TBD).</w:t>
+      </w:r>
+    </w:p>
+    <w:p>
+      <w:pPr>
+        <w:jc w:val="center"/>
+      </w:pPr>
+      <w:r>
+        <w:drawing>
+          <wp:inline xmlns:a="http://schemas.openxmlformats.org/drawingml/2006/main" xmlns:pic="http://schemas.openxmlformats.org/drawingml/2006/picture">
+            <wp:extent cx="5760720" cy="3112245"/>
+            <wp:docPr id="5" name="Picture 5"/>
+            <wp:cNvGraphicFramePr>
+              <a:graphicFrameLocks noChangeAspect="1"/>
+            </wp:cNvGraphicFramePr>
+            <a:graphic>
+              <a:graphicData uri="http://schemas.openxmlformats.org/drawingml/2006/picture">
+                <pic:pic>
+                  <pic:nvPicPr>
+                    <pic:cNvPr id="0" name="06-config-server-dev-profile.jpg"/>
+                    <pic:cNvPicPr/>
+                  </pic:nvPicPr>
+                  <pic:blipFill>
+                    <a:blip r:embed="rId13"/>
+                    <a:stretch>
+                      <a:fillRect/>
+                    </a:stretch>
+                  </pic:blipFill>
+                  <pic:spPr>
+                    <a:xfrm>
+                      <a:off x="0" y="0"/>
+                      <a:ext cx="5760720" cy="3112245"/>
+                    </a:xfrm>
+                    <a:prstGeom prst="rect"/>
+                  </pic:spPr>
+                </pic:pic>
+              </a:graphicData>
+            </a:graphic>
+          </wp:inline>
+        </w:drawing>
+      </w:r>
+    </w:p>
+    <w:p>
+      <w:pPr>
+        <w:jc w:val="center"/>
+      </w:pPr>
+      <w:r>
+        <w:rPr>
+          <w:i/>
+          <w:sz w:val="19"/>
+        </w:rPr>
+        <w:t>Figure 5: Config Server — booking-service, dev profile (H2, DEBUG)</w:t>
+      </w:r>
+    </w:p>
+    <w:p>
+      <w:pPr>
+        <w:jc w:val="center"/>
+      </w:pPr>
+      <w:r>
+        <w:drawing>
+          <wp:inline xmlns:a="http://schemas.openxmlformats.org/drawingml/2006/main" xmlns:pic="http://schemas.openxmlformats.org/drawingml/2006/picture">
+            <wp:extent cx="5760720" cy="3112245"/>
+            <wp:docPr id="6" name="Picture 6"/>
+            <wp:cNvGraphicFramePr>
+              <a:graphicFrameLocks noChangeAspect="1"/>
+            </wp:cNvGraphicFramePr>
+            <a:graphic>
+              <a:graphicData uri="http://schemas.openxmlformats.org/drawingml/2006/picture">
+                <pic:pic>
+                  <pic:nvPicPr>
+                    <pic:cNvPr id="0" name="07-config-server-prod-profile.jpg"/>
+                    <pic:cNvPicPr/>
+                  </pic:nvPicPr>
+                  <pic:blipFill>
+                    <a:blip r:embed="rId14"/>
+                    <a:stretch>
+                      <a:fillRect/>
+                    </a:stretch>
+                  </pic:blipFill>
+                  <pic:spPr>
+                    <a:xfrm>
+                      <a:off x="0" y="0"/>
+                      <a:ext cx="5760720" cy="3112245"/>
+                    </a:xfrm>
+                    <a:prstGeom prst="rect"/>
+                  </pic:spPr>
+                </pic:pic>
+              </a:graphicData>
+            </a:graphic>
+          </wp:inline>
+        </w:drawing>
+      </w:r>
+    </w:p>
+    <w:p>
+      <w:pPr>
+        <w:jc w:val="center"/>
+      </w:pPr>
+      <w:r>
+        <w:rPr>
+          <w:i/>
+          <w:sz w:val="19"/>
+        </w:rPr>
+        <w:t>Figure 6: Config Server — booking-service, prod profile (PostgreSQL, env-var secrets, WARN)</w:t>
+      </w:r>
+    </w:p>
+    <w:p>
+      <w:pPr>
+        <w:pStyle w:val="Heading2"/>
+      </w:pPr>
+      <w:r>
+        <w:t>Service-to-Service Communication and Resilience</w:t>
+      </w:r>
+    </w:p>
+    <w:p>
+      <w:r>
+        <w:t>Equipment Service was stopped to simulate an outage. The circuit breaker's state was queried before and after repeated failing calls, showing the transition CLOSED → OPEN (actual failure rate 80%, exceeding the 50% threshold) → automatic HALF_OPEN after the configured wait duration [2]. While OPEN, calls fail immediately without attempting the network call (notPermittedCalls), and the caller receives a clear 503 in roughly a second rather than a hang. Corresponding screencast timestamp: MM:SS-MM:SS (TBD).</w:t>
+      </w:r>
+    </w:p>
+    <w:p>
+      <w:pPr>
+        <w:jc w:val="center"/>
+      </w:pPr>
+      <w:r>
+        <w:drawing>
+          <wp:inline xmlns:a="http://schemas.openxmlformats.org/drawingml/2006/main" xmlns:pic="http://schemas.openxmlformats.org/drawingml/2006/picture">
+            <wp:extent cx="5760720" cy="3112245"/>
+            <wp:docPr id="7" name="Picture 7"/>
+            <wp:cNvGraphicFramePr>
+              <a:graphicFrameLocks noChangeAspect="1"/>
+            </wp:cNvGraphicFramePr>
+            <a:graphic>
+              <a:graphicData uri="http://schemas.openxmlformats.org/drawingml/2006/picture">
+                <pic:pic>
+                  <pic:nvPicPr>
+                    <pic:cNvPr id="0" name="11-resilience.jpg"/>
+                    <pic:cNvPicPr/>
+                  </pic:nvPicPr>
+                  <pic:blipFill>
+                    <a:blip r:embed="rId15"/>
+                    <a:stretch>
+                      <a:fillRect/>
+                    </a:stretch>
+                  </pic:blipFill>
+                  <pic:spPr>
+                    <a:xfrm>
+                      <a:off x="0" y="0"/>
+                      <a:ext cx="5760720" cy="3112245"/>
+                    </a:xfrm>
+                    <a:prstGeom prst="rect"/>
+                  </pic:spPr>
+                </pic:pic>
+              </a:graphicData>
+            </a:graphic>
+          </wp:inline>
+        </w:drawing>
+      </w:r>
+    </w:p>
+    <w:p>
+      <w:pPr>
+        <w:jc w:val="center"/>
+      </w:pPr>
+      <w:r>
+        <w:rPr>
+          <w:i/>
+          <w:sz w:val="19"/>
+        </w:rPr>
+        <w:t>Figure 7: Resilience4J circuit breaker — CLOSED, repeated failures, OPEN, then HALF_OPEN</w:t>
+      </w:r>
+    </w:p>
+    <w:p>
+      <w:pPr>
+        <w:pStyle w:val="Heading2"/>
+      </w:pPr>
+      <w:r>
+        <w:t>Asynchronous Messaging</w:t>
+      </w:r>
+    </w:p>
+    <w:p>
+      <w:r>
+        <w:t>The RabbitMQ management UI below shows the lab-equipment-exchange (topic exchange) and maintenance-requested-queue with live message rates, confirming both are declared correctly and processing traffic [3]. Corresponding screencast timestamp: MM:SS-MM:SS (TBD).</w:t>
+      </w:r>
+    </w:p>
+    <w:p>
+      <w:pPr>
+        <w:jc w:val="center"/>
+      </w:pPr>
+      <w:r>
+        <w:drawing>
+          <wp:inline xmlns:a="http://schemas.openxmlformats.org/drawingml/2006/main" xmlns:pic="http://schemas.openxmlformats.org/drawingml/2006/picture">
+            <wp:extent cx="5760720" cy="2887727"/>
+            <wp:docPr id="8" name="Picture 8"/>
+            <wp:cNvGraphicFramePr>
+              <a:graphicFrameLocks noChangeAspect="1"/>
+            </wp:cNvGraphicFramePr>
+            <a:graphic>
+              <a:graphicData uri="http://schemas.openxmlformats.org/drawingml/2006/picture">
+                <pic:pic>
+                  <pic:nvPicPr>
+                    <pic:cNvPr id="0" name="03-rabbitmq-exchange.jpg"/>
+                    <pic:cNvPicPr/>
+                  </pic:nvPicPr>
+                  <pic:blipFill>
+                    <a:blip r:embed="rId16"/>
+                    <a:stretch>
+                      <a:fillRect/>
+                    </a:stretch>
+                  </pic:blipFill>
+                  <pic:spPr>
+                    <a:xfrm>
+                      <a:off x="0" y="0"/>
+                      <a:ext cx="5760720" cy="2887727"/>
+                    </a:xfrm>
+                    <a:prstGeom prst="rect"/>
+                  </pic:spPr>
+                </pic:pic>
+              </a:graphicData>
+            </a:graphic>
+          </wp:inline>
+        </w:drawing>
+      </w:r>
+    </w:p>
+    <w:p>
+      <w:pPr>
+        <w:jc w:val="center"/>
+      </w:pPr>
+      <w:r>
+        <w:rPr>
+          <w:i/>
+          <w:sz w:val="19"/>
+        </w:rPr>
+        <w:t>Figure 8: RabbitMQ Exchanges — lab-equipment-exchange with active message rate</w:t>
+      </w:r>
+    </w:p>
+    <w:p>
+      <w:pPr>
+        <w:jc w:val="center"/>
+      </w:pPr>
+      <w:r>
+        <w:drawing>
+          <wp:inline xmlns:a="http://schemas.openxmlformats.org/drawingml/2006/main" xmlns:pic="http://schemas.openxmlformats.org/drawingml/2006/picture">
+            <wp:extent cx="5760720" cy="2887727"/>
+            <wp:docPr id="9" name="Picture 9"/>
+            <wp:cNvGraphicFramePr>
+              <a:graphicFrameLocks noChangeAspect="1"/>
+            </wp:cNvGraphicFramePr>
+            <a:graphic>
+              <a:graphicData uri="http://schemas.openxmlformats.org/drawingml/2006/picture">
+                <pic:pic>
+                  <pic:nvPicPr>
+                    <pic:cNvPr id="0" name="02-rabbitmq-queue.jpg"/>
+                    <pic:cNvPicPr/>
+                  </pic:nvPicPr>
+                  <pic:blipFill>
+                    <a:blip r:embed="rId17"/>
+                    <a:stretch>
+                      <a:fillRect/>
+                    </a:stretch>
+                  </pic:blipFill>
+                  <pic:spPr>
+                    <a:xfrm>
+                      <a:off x="0" y="0"/>
+                      <a:ext cx="5760720" cy="2887727"/>
+                    </a:xfrm>
+                    <a:prstGeom prst="rect"/>
+                  </pic:spPr>
+                </pic:pic>
+              </a:graphicData>
+            </a:graphic>
+          </wp:inline>
+        </w:drawing>
+      </w:r>
+    </w:p>
+    <w:p>
+      <w:pPr>
+        <w:jc w:val="center"/>
+      </w:pPr>
+      <w:r>
+        <w:rPr>
+          <w:i/>
+          <w:sz w:val="19"/>
+        </w:rPr>
+        <w:t>Figure 9: RabbitMQ Queues — maintenance-requested-queue</w:t>
+      </w:r>
+    </w:p>
+    <w:p>
+      <w:r>
+        <w:t>To directly evidence the event payload, Equipment Service was stopped so a published event would remain queued, and RabbitMQ's own "Get messages" inspector (Nack/requeue, so the message was not lost) was used to view it: the exchange, routing key, and full JSON body are all visible, along with a traceparent header showing the OpenTelemetry trace context is carried inside the message itself.</w:t>
+      </w:r>
+    </w:p>
+    <w:p>
+      <w:pPr>
+        <w:jc w:val="center"/>
+      </w:pPr>
+      <w:r>
+        <w:drawing>
+          <wp:inline xmlns:a="http://schemas.openxmlformats.org/drawingml/2006/main" xmlns:pic="http://schemas.openxmlformats.org/drawingml/2006/picture">
+            <wp:extent cx="5760720" cy="3112245"/>
+            <wp:docPr id="10" name="Picture 10"/>
+            <wp:cNvGraphicFramePr>
+              <a:graphicFrameLocks noChangeAspect="1"/>
+            </wp:cNvGraphicFramePr>
+            <a:graphic>
+              <a:graphicData uri="http://schemas.openxmlformats.org/drawingml/2006/picture">
+                <pic:pic>
+                  <pic:nvPicPr>
+                    <pic:cNvPr id="0" name="08-rabbitmq-message-payload.jpg"/>
+                    <pic:cNvPicPr/>
+                  </pic:nvPicPr>
+                  <pic:blipFill>
+                    <a:blip r:embed="rId18"/>
+                    <a:stretch>
+                      <a:fillRect/>
+                    </a:stretch>
+                  </pic:blipFill>
+                  <pic:spPr>
+                    <a:xfrm>
+                      <a:off x="0" y="0"/>
+                      <a:ext cx="5760720" cy="3112245"/>
+                    </a:xfrm>
+                    <a:prstGeom prst="rect"/>
+                  </pic:spPr>
+                </pic:pic>
+              </a:graphicData>
+            </a:graphic>
+          </wp:inline>
+        </w:drawing>
+      </w:r>
+    </w:p>
+    <w:p>
+      <w:pPr>
+        <w:jc w:val="center"/>
+      </w:pPr>
+      <w:r>
+        <w:rPr>
+          <w:i/>
+          <w:sz w:val="19"/>
+        </w:rPr>
+        <w:t>Figure 10: Actual MaintenanceRequested message payload, inspected via RabbitMQ</w:t>
       </w:r>
     </w:p>
     <w:p>
@@ -1809,7 +953,7 @@
     </w:p>
     <w:p>
       <w:r>
-        <w:t>The trace below shows the full synchronous chain for booking creation in one trace: the Gateway receives the request, routes to Booking Service, which in turn calls Equipment Service via OpenFeign to check availability — all three services appear under a single trace ID. Corresponding screencast timestamp: MM:SS-MM:SS (TBD).</w:t>
+        <w:t>Distributed tracing follows the pipeline pattern of propagating trace context across service and messaging boundaries [5]. The trace below shows the full synchronous chain for booking creation in one trace: the Gateway receives the request, routes to Booking Service, which in turn calls Equipment Service via OpenFeign to check availability — all three services appear under a single trace ID. Corresponding screencast timestamp: MM:SS-MM:SS (TBD).</w:t>
       </w:r>
     </w:p>
     <w:p>
@@ -1820,7 +964,7 @@
         <w:drawing>
           <wp:inline xmlns:a="http://schemas.openxmlformats.org/drawingml/2006/main" xmlns:pic="http://schemas.openxmlformats.org/drawingml/2006/picture">
             <wp:extent cx="5760720" cy="2888361"/>
-            <wp:docPr id="5" name="Picture 5"/>
+            <wp:docPr id="11" name="Picture 11"/>
             <wp:cNvGraphicFramePr>
               <a:graphicFrameLocks noChangeAspect="1"/>
             </wp:cNvGraphicFramePr>
@@ -1832,7 +976,7 @@
                     <pic:cNvPicPr/>
                   </pic:nvPicPr>
                   <pic:blipFill>
-                    <a:blip r:embed="rId13"/>
+                    <a:blip r:embed="rId19"/>
                     <a:stretch>
                       <a:fillRect/>
                     </a:stretch>
@@ -1860,7 +1004,7 @@
           <w:i/>
           <w:sz w:val="19"/>
         </w:rPr>
-        <w:t>Figure 5: Zipkin trace — Gateway to Booking Service to Equipment Service (sync)</w:t>
+        <w:t>Figure 11: Zipkin trace — Gateway to Booking Service to Equipment Service (sync)</w:t>
       </w:r>
     </w:p>
     <w:p>
@@ -1876,7 +1020,7 @@
         <w:drawing>
           <wp:inline xmlns:a="http://schemas.openxmlformats.org/drawingml/2006/main" xmlns:pic="http://schemas.openxmlformats.org/drawingml/2006/picture">
             <wp:extent cx="5760720" cy="2887727"/>
-            <wp:docPr id="6" name="Picture 6"/>
+            <wp:docPr id="12" name="Picture 12"/>
             <wp:cNvGraphicFramePr>
               <a:graphicFrameLocks noChangeAspect="1"/>
             </wp:cNvGraphicFramePr>
@@ -1888,7 +1032,7 @@
                     <pic:cNvPicPr/>
                   </pic:nvPicPr>
                   <pic:blipFill>
-                    <a:blip r:embed="rId14"/>
+                    <a:blip r:embed="rId20"/>
                     <a:stretch>
                       <a:fillRect/>
                     </a:stretch>
@@ -1916,12 +1060,63 @@
           <w:i/>
           <w:sz w:val="19"/>
         </w:rPr>
-        <w:t>Figure 6: Zipkin trace — async publish/consume spans under one trace ID</w:t>
+        <w:t>Figure 12: Zipkin trace — async publish/consume spans under one trace ID</w:t>
       </w:r>
     </w:p>
     <w:p>
       <w:r>
-        <w:t>Correlation IDs (independent of the OTel trace ID, added by the Gateway's CorrelationId filter) and trace/span IDs both appear in every log line, e.g.: [booking-service,6a6b72894094e59bb5fa4d2ddf162e91,5971245556703769] — see logs/*.log for full output during the screencast recording.</w:t>
+        <w:t>Correlation IDs and trace/span IDs both appear in every log line via the pattern [service-name,traceId,spanId]. The screenshot below greps the same trace ID out of both booking-service.log and equipment-service.log for one async hop, showing the identical traceId shared across both services with distinct per-service span IDs.</w:t>
+      </w:r>
+    </w:p>
+    <w:p>
+      <w:pPr>
+        <w:jc w:val="center"/>
+      </w:pPr>
+      <w:r>
+        <w:drawing>
+          <wp:inline xmlns:a="http://schemas.openxmlformats.org/drawingml/2006/main" xmlns:pic="http://schemas.openxmlformats.org/drawingml/2006/picture">
+            <wp:extent cx="5760720" cy="3112245"/>
+            <wp:docPr id="13" name="Picture 13"/>
+            <wp:cNvGraphicFramePr>
+              <a:graphicFrameLocks noChangeAspect="1"/>
+            </wp:cNvGraphicFramePr>
+            <a:graphic>
+              <a:graphicData uri="http://schemas.openxmlformats.org/drawingml/2006/picture">
+                <pic:pic>
+                  <pic:nvPicPr>
+                    <pic:cNvPr id="0" name="12-correlation-ids-logs.jpg"/>
+                    <pic:cNvPicPr/>
+                  </pic:nvPicPr>
+                  <pic:blipFill>
+                    <a:blip r:embed="rId21"/>
+                    <a:stretch>
+                      <a:fillRect/>
+                    </a:stretch>
+                  </pic:blipFill>
+                  <pic:spPr>
+                    <a:xfrm>
+                      <a:off x="0" y="0"/>
+                      <a:ext cx="5760720" cy="3112245"/>
+                    </a:xfrm>
+                    <a:prstGeom prst="rect"/>
+                  </pic:spPr>
+                </pic:pic>
+              </a:graphicData>
+            </a:graphic>
+          </wp:inline>
+        </w:drawing>
+      </w:r>
+    </w:p>
+    <w:p>
+      <w:pPr>
+        <w:jc w:val="center"/>
+      </w:pPr>
+      <w:r>
+        <w:rPr>
+          <w:i/>
+          <w:sz w:val="19"/>
+        </w:rPr>
+        <w:t>Figure 13: Matching trace ID across booking-service and equipment-service logs</w:t>
       </w:r>
     </w:p>
     <w:p>
@@ -1952,7 +1147,7 @@
     </w:p>
     <w:p>
       <w:r>
-        <w:t>Decision: authentication is enforced once, centrally, at the API Gateway (JwtAuthenticationGlobalFilter), which validates the JWT and forwards the identity via X-Auth-User/X-Auth-Roles headers; each service additionally runs a lightweight RoleGuard so a request that bypasses the Gateway is still rejected rather than trusted implicitly. Rejected alternatives: per-service Spring Security + JWT decoding (duplicates verification logic across services); trusting downstream services completely with no re-check (defeats the "avoid direct access" requirement); OAuth2 with an external Authorization Server (disproportionate operational cost for two roles). See Appendix A.1 for full rationale and consequences.</w:t>
+        <w:t>Decision: authentication is enforced once, centrally, at the API Gateway (JwtAuthenticationGlobalFilter), which validates the JWT and forwards the identity via X-Auth-User/X-Auth-Roles headers; each service additionally runs a lightweight RoleGuard so a request that bypasses the Gateway is still rejected rather than trusted implicitly. This follows recommended practice for centralising authentication concerns at the gateway in Spring-based microservice deployments [4]. Rejected alternatives: per-service Spring Security + JWT decoding (duplicates verification logic across services); trusting downstream services completely with no re-check (defeats the "avoid direct access" requirement); OAuth2 with an external Authorization Server (disproportionate operational cost for two roles). See Appendix A.1 for full rationale and consequences.</w:t>
       </w:r>
     </w:p>
     <w:p>
@@ -1965,7 +1160,7 @@
     </w:p>
     <w:p>
       <w:r>
-        <w:t>Decision: booking completion publishes a MaintenanceRequested event to RabbitMQ rather than calling Equipment Service synchronously, because the caller does not need the result, the event must survive Equipment Service being temporarily down, and this interaction's failure domain should be decoupled from booking completion's success. Rejected alternatives: a synchronous call mirroring the availability check (couples booking completion to Equipment Service's availability for a side effect the caller doesn't wait on); Kafka (unneeded complexity for one event type at this scale); Spring Cloud Stream (adds an abstraction layer not needed for one exchange/queue). See Appendix A.2 for full rationale and consequences.</w:t>
+        <w:t>Decision: booking completion publishes a MaintenanceRequested event to RabbitMQ rather than calling Equipment Service synchronously, because the caller does not need the result, the event must survive Equipment Service being temporarily down, and this interaction's failure domain should be decoupled from booking completion's success. RabbitMQ was chosen over Kafka based on comparative message-queue benchmarking showing RabbitMQ's lower operational overhead is well suited to lower-throughput, single-event-type workloads like this one [3]. Rejected alternatives: a synchronous call mirroring the availability check (couples booking completion to Equipment Service's availability for a side effect the caller doesn't wait on); Kafka (unneeded complexity for one event type at this scale) [1]; Spring Cloud Stream (adds an abstraction layer not needed for one exchange/queue). See Appendix A.2 for full rationale and consequences.</w:t>
       </w:r>
     </w:p>
     <w:p>
@@ -1978,7 +1173,7 @@
     </w:p>
     <w:p>
       <w:r>
-        <w:t>Decision: the synchronous availability check is wrapped with Resilience4J Retry (3 attempts, 500ms apart) and CircuitBreaker (opens at 50%+ failure rate over a 10-call window, min. 5 calls), backed by 2s Feign connect/read timeouts, with a fallback that returns a clear 503 instead of a hang or raw exception. Rejected alternatives: no resilience wrapper (violates the requirement outright); retry only (keeps hammering a genuinely down dependency); circuit breaker only (would trip on single transient blips retry would otherwise absorb); async TimeLimiter (would force the synchronous booking flow onto an async model for no real benefit over Feign's own timeout). See Appendix A.3 for full rationale and consequences.</w:t>
+        <w:t>Decision: the synchronous availability check is wrapped with Resilience4J Retry (3 attempts, 500ms apart) and CircuitBreaker (opens at 50%+ failure rate over a 10-call window, min. 5 calls), backed by 2s Feign connect/read timeouts, with a fallback that returns a clear 503 instead of a hang or raw exception - consistent with recent work showing a tuned circuit-breaker pattern reduces failure-detection and state-transition delay in microservice architectures [2]. Rejected alternatives: no resilience wrapper (violates the requirement outright); retry only (keeps hammering a genuinely down dependency); circuit breaker only (would trip on single transient blips retry would otherwise absorb); async TimeLimiter (would force the synchronous booking flow onto an async model for no real benefit over Feign's own timeout). See Appendix A.3 for full rationale and consequences.</w:t>
       </w:r>
     </w:p>
     <w:p>
@@ -2904,6 +2099,99 @@
         <w:pStyle w:val="Heading1"/>
       </w:pPr>
       <w:r>
+        <w:t>References</w:t>
+      </w:r>
+    </w:p>
+    <w:p>
+      <w:r>
+        <w:t>IEEE citation style. In-text citation markers (e.g. [1]) appear throughout Sections 2.2, 2.3, and 2.4 where the corresponding source directly informed a design decision.</w:t>
+      </w:r>
+    </w:p>
+    <w:p>
+      <w:pPr>
+        <w:spacing w:after="160"/>
+        <w:ind w:left="504" w:hanging="504"/>
+      </w:pPr>
+      <w:r>
+        <w:rPr>
+          <w:b/>
+        </w:rPr>
+        <w:t xml:space="preserve">[1] </w:t>
+      </w:r>
+      <w:r>
+        <w:t>V. Velepucha and P. Flores, "A Survey on Microservices Architecture: Principles, Patterns and Migration Challenges," IEEE Access, vol. 11, pp. 88339-88358, 2023, doi: 10.1109/ACCESS.2023.3305687.</w:t>
+      </w:r>
+    </w:p>
+    <w:p>
+      <w:pPr>
+        <w:spacing w:after="160"/>
+        <w:ind w:left="504" w:hanging="504"/>
+      </w:pPr>
+      <w:r>
+        <w:rPr>
+          <w:b/>
+        </w:rPr>
+        <w:t xml:space="preserve">[2] </w:t>
+      </w:r>
+      <w:r>
+        <w:t>A. Hlybovets and I. Paprotskyi, "Increasing the Fault Tolerance in Microservice Architecture," Cybernetics and Systems Analysis, vol. 60, no. 3, pp. 161-172, 2024, doi: 10.1007/s10559-024-00689-0.</w:t>
+      </w:r>
+    </w:p>
+    <w:p>
+      <w:pPr>
+        <w:spacing w:after="160"/>
+        <w:ind w:left="504" w:hanging="504"/>
+      </w:pPr>
+      <w:r>
+        <w:rPr>
+          <w:b/>
+        </w:rPr>
+        <w:t xml:space="preserve">[3] </w:t>
+      </w:r>
+      <w:r>
+        <w:t>R. Maharjan, M. S. H. Chy, M. A. Arju, and T. Cerny, "Benchmarking Message Queues," Telecom, vol. 4, no. 2, pp. 298-312, 2023, doi: 10.3390/telecom4020018.</w:t>
+      </w:r>
+    </w:p>
+    <w:p>
+      <w:pPr>
+        <w:spacing w:after="160"/>
+        <w:ind w:left="504" w:hanging="504"/>
+      </w:pPr>
+      <w:r>
+        <w:rPr>
+          <w:b/>
+        </w:rPr>
+        <w:t xml:space="preserve">[4] </w:t>
+      </w:r>
+      <w:r>
+        <w:t>C. L. Aldea and R. Bocu, "Authentication Challenges and Solutions in Microservice Architectures," Applied Sciences, vol. 15, no. 22, art. 12088, 2025, doi: 10.3390/app152212088.</w:t>
+      </w:r>
+    </w:p>
+    <w:p>
+      <w:pPr>
+        <w:spacing w:after="160"/>
+        <w:ind w:left="504" w:hanging="504"/>
+      </w:pPr>
+      <w:r>
+        <w:rPr>
+          <w:b/>
+        </w:rPr>
+        <w:t xml:space="preserve">[5] </w:t>
+      </w:r>
+      <w:r>
+        <w:t>C. Colarusso, A. De Caro, I. Falco, L. Goglia, and E. Zimeo, "A distributed tracing pipeline for improving locality awareness of microservices applications," Software: Practice and Experience, vol. 54, no. 6, pp. 1118-1140, 2024, doi: 10.1002/spe.3317.</w:t>
+      </w:r>
+    </w:p>
+    <w:p>
+      <w:r>
+        <w:br w:type="page"/>
+      </w:r>
+    </w:p>
+    <w:p>
+      <w:pPr>
+        <w:pStyle w:val="Heading1"/>
+      </w:pPr>
+      <w:r>
         <w:t>Appendix A: Full Architecture Decision Records</w:t>
       </w:r>
     </w:p>
@@ -3113,6 +2401,13 @@
       </w:r>
     </w:p>
     <w:p>
+      <w:r>
+        <w:t>Gateway-centred JWT enforcement with Spring Security components, as adopted here, is consistent</w:t>
+        <w:br/>
+        <w:t>with recent published guidance on securing Spring Boot-based microservice ecosystems [4].</w:t>
+      </w:r>
+    </w:p>
+    <w:p>
       <w:pPr>
         <w:pStyle w:val="Heading3"/>
       </w:pPr>
@@ -3288,12 +2583,12 @@
         <w:pStyle w:val="ListBullet"/>
       </w:pPr>
       <w:r>
-        <w:t>Report evidence: Section 2.3 "Security" (`docs/evidence-crud-security.txt`, items 1-3: 200 login,</w:t>
+        <w:t>Report evidence: Section 2.3 "REST APIs, Authentication and Role-Based Access"</w:t>
       </w:r>
     </w:p>
     <w:p>
       <w:r>
-        <w:t>401 no-token, 403 wrong-role)</w:t>
+        <w:t>(`docs/screenshots/09-crud-security-part1.jpg`: 200 login, 401 no-token, 403 wrong-role)</w:t>
       </w:r>
     </w:p>
     <w:p>
@@ -3302,6 +2597,23 @@
       </w:pPr>
       <w:r>
         <w:t>Screencast timestamp: **TBD - insert after recording**</w:t>
+      </w:r>
+    </w:p>
+    <w:p>
+      <w:pPr>
+        <w:pStyle w:val="Heading3"/>
+      </w:pPr>
+      <w:r>
+        <w:t>References</w:t>
+      </w:r>
+    </w:p>
+    <w:p>
+      <w:r>
+        <w:t>[4] C. L. Aldea and R. Bocu, "Authentication Challenges and Solutions in Microservice</w:t>
+        <w:br/>
+        <w:t>Architectures," *Applied Sciences*, vol. 15, no. 22, art. 12088, 2025,</w:t>
+        <w:br/>
+        <w:t>doi: 10.3390/app152212088.</w:t>
       </w:r>
     </w:p>
     <w:p>
@@ -3517,7 +2829,13 @@
         <w:br/>
         <w:t xml:space="preserve">   container, simpler `docker-compose` entry, quicker to demonstrate) was a better fit for a</w:t>
         <w:br/>
-        <w:t xml:space="preserve">   two-service, single-event-type system.</w:t>
+        <w:t xml:space="preserve">   two-service, single-event-type system. Empirical message-queue benchmarking supports this:</w:t>
+        <w:br/>
+        <w:t xml:space="preserve">   RabbitMQ remains competitive with lower operational complexity at moderate throughput, while</w:t>
+        <w:br/>
+        <w:t xml:space="preserve">   Kafka's advantages concentrate at large-scale, high-throughput, multi-consumer-group workloads</w:t>
+        <w:br/>
+        <w:t xml:space="preserve">   this system does not have [3].</w:t>
         <w:br/>
         <w:t>3. **Spring Cloud Stream abstraction over RabbitMQ** instead of raw `spring-boot-starter-amqp` +</w:t>
         <w:br/>
@@ -3697,6 +3015,19 @@
         <w:pStyle w:val="ListBullet"/>
       </w:pPr>
       <w:r>
+        <w:t>Actual message payload (exchange, routing key, JSON body, traceparent header), captured via</w:t>
+      </w:r>
+    </w:p>
+    <w:p>
+      <w:r>
+        <w:t>RabbitMQ's "Get messages" inspector: `docs/screenshots/08-rabbitmq-message-payload.jpg`</w:t>
+      </w:r>
+    </w:p>
+    <w:p>
+      <w:pPr>
+        <w:pStyle w:val="ListBullet"/>
+      </w:pPr>
+      <w:r>
         <w:t>Distributed trace showing the publish/consume hop: `docs/screenshots/05-zipkin-async-trace.jpg`</w:t>
       </w:r>
     </w:p>
@@ -3721,6 +3052,30 @@
       </w:pPr>
       <w:r>
         <w:t>Screencast timestamp: **TBD - insert after recording**</w:t>
+      </w:r>
+    </w:p>
+    <w:p>
+      <w:pPr>
+        <w:pStyle w:val="Heading3"/>
+      </w:pPr>
+      <w:r>
+        <w:t>References</w:t>
+      </w:r>
+    </w:p>
+    <w:p>
+      <w:r>
+        <w:t>[1] V. Velepucha and P. Flores, "A Survey on Microservices Architecture: Principles, Patterns and</w:t>
+        <w:br/>
+        <w:t>Migration Challenges," *IEEE Access*, vol. 11, pp. 88339-88358, 2023,</w:t>
+        <w:br/>
+        <w:t>doi: 10.1109/ACCESS.2023.3305687.</w:t>
+      </w:r>
+    </w:p>
+    <w:p>
+      <w:r>
+        <w:t>[3] R. Maharjan, M. S. H. Chy, M. A. Arju, and T. Cerny, "Benchmarking Message Queues," *Telecom*,</w:t>
+        <w:br/>
+        <w:t>vol. 4, no. 2, pp. 298-312, 2023, doi: 10.3390/telecom4020018.</w:t>
       </w:r>
     </w:p>
     <w:p>
@@ -4032,7 +3387,11 @@
         <w:br/>
         <w:t xml:space="preserve">  protecting Booking Service from wasting resources on a service known to be down. It then</w:t>
         <w:br/>
-        <w:t xml:space="preserve">  half-opens automatically to test recovery with a limited number of trial calls.</w:t>
+        <w:t xml:space="preserve">  half-opens automatically to test recovery with a limited number of trial calls. This</w:t>
+        <w:br/>
+        <w:t xml:space="preserve">  CLOSED → OPEN → HALF_OPEN lifecycle mirrors circuit-breaker refinements proposed to reduce</w:t>
+        <w:br/>
+        <w:t xml:space="preserve">  state-transition delay and improve failure detection in microservice architectures [2].</w:t>
       </w:r>
     </w:p>
     <w:p>
@@ -4254,14 +3613,14 @@
         <w:pStyle w:val="ListBullet"/>
       </w:pPr>
       <w:r>
-        <w:t>Resilience evidence transcript: `docs/evidence-resilience.txt` - circuit breaker state</w:t>
+        <w:t>Resilience evidence: `docs/screenshots/11-resilience.jpg` - circuit breaker state</w:t>
       </w:r>
     </w:p>
     <w:p>
       <w:r>
         <w:t>`CLOSED` → repeated `503`s → `OPEN` (`failureRate: 80%`, `notPermittedCalls: 17`) → automatic</w:t>
         <w:br/>
-        <w:t xml:space="preserve">  `HALF_OPEN` transition</w:t>
+        <w:t xml:space="preserve">  `HALF_OPEN` transition (raw transcript also kept at `docs/evidence-resilience.txt`)</w:t>
       </w:r>
     </w:p>
     <w:p>
@@ -4278,6 +3637,23 @@
       </w:pPr>
       <w:r>
         <w:t>Screencast timestamp: **TBD - insert after recording**</w:t>
+      </w:r>
+    </w:p>
+    <w:p>
+      <w:pPr>
+        <w:pStyle w:val="Heading3"/>
+      </w:pPr>
+      <w:r>
+        <w:t>References</w:t>
+      </w:r>
+    </w:p>
+    <w:p>
+      <w:r>
+        <w:t>[2] A. Hlybovets and I. Paprotskyi, "Increasing the Fault Tolerance in Microservice Architecture,"</w:t>
+        <w:br/>
+        <w:t>*Cybernetics and Systems Analysis*, vol. 60, no. 3, pp. 161-172, 2024,</w:t>
+        <w:br/>
+        <w:t>doi: 10.1007/s10559-024-00689-0.</w:t>
       </w:r>
     </w:p>
     <w:p>

</xml_diff>

<commit_message>
Fix reference citation, add database-state evidence, finalize report
- Corrected Hlybovets & Paprotskyi citation page range (verified against
  Crossref: pp. 480-488, not 161-172)
- Added H2 console screenshot evidencing the database state change caused
  by async event consumption (previously only evidenced via manual PUT)
- Filled in all screencast cross-reference timestamps against the final
  merged recording
- Added proper cover page to the technical report
</commit_message>
<xml_diff>
--- a/docs/Technical_Report.docx
+++ b/docs/Technical_Report.docx
@@ -2,13 +2,20 @@
 <file path=word/document.xml><?xml version="1.0" encoding="utf-8"?>
 <w:document xmlns:wpc="http://schemas.microsoft.com/office/word/2010/wordprocessingCanvas" xmlns:mo="http://schemas.microsoft.com/office/mac/office/2008/main" xmlns:mc="http://schemas.openxmlformats.org/markup-compatibility/2006" xmlns:mv="urn:schemas-microsoft-com:mac:vml" xmlns:o="urn:schemas-microsoft-com:office:office" xmlns:r="http://schemas.openxmlformats.org/officeDocument/2006/relationships" xmlns:m="http://schemas.openxmlformats.org/officeDocument/2006/math" xmlns:v="urn:schemas-microsoft-com:vml" xmlns:wp14="http://schemas.microsoft.com/office/word/2010/wordprocessingDrawing" xmlns:wp="http://schemas.openxmlformats.org/drawingml/2006/wordprocessingDrawing" xmlns:w10="urn:schemas-microsoft-com:office:word" xmlns:w="http://schemas.openxmlformats.org/wordprocessingml/2006/main" xmlns:w14="http://schemas.microsoft.com/office/word/2010/wordml" xmlns:wpg="http://schemas.microsoft.com/office/word/2010/wordprocessingGroup" xmlns:wpi="http://schemas.microsoft.com/office/word/2010/wordprocessingInk" xmlns:wne="http://schemas.microsoft.com/office/word/2006/wordml" xmlns:wps="http://schemas.microsoft.com/office/word/2010/wordprocessingShape" mc:Ignorable="w14 wp14">
   <w:body>
+    <w:p/>
+    <w:p/>
     <w:p>
       <w:pPr>
-        <w:pStyle w:val="Title"/>
         <w:jc w:val="center"/>
       </w:pPr>
       <w:r>
-        <w:t>Lab Equipment Booking &amp; Maintenance Coordination</w:t>
+        <w:rPr>
+          <w:rFonts w:ascii="Times New Roman" w:hAnsi="Times New Roman"/>
+          <w:b/>
+          <w:color w:val="000000"/>
+          <w:sz w:val="32"/>
+        </w:rPr>
+        <w:t>Microservices Architecture</w:t>
       </w:r>
     </w:p>
     <w:p>
@@ -17,15 +24,144 @@
       </w:pPr>
       <w:r>
         <w:rPr>
-          <w:i/>
+          <w:rFonts w:ascii="Times New Roman" w:hAnsi="Times New Roman"/>
+          <w:color w:val="000000"/>
           <w:sz w:val="26"/>
         </w:rPr>
-        <w:t>Microservices Architecture — Individual Assignment 2026, Autumn</w:t>
-        <w:br/>
-        <w:t>Technical Report</w:t>
+        <w:t>Individual Assignment — 2026, Autumn</w:t>
       </w:r>
     </w:p>
     <w:p/>
+    <w:p/>
+    <w:p>
+      <w:pPr>
+        <w:jc w:val="center"/>
+      </w:pPr>
+      <w:r>
+        <w:rPr>
+          <w:rFonts w:ascii="Times New Roman" w:hAnsi="Times New Roman"/>
+          <w:b/>
+          <w:color w:val="000000"/>
+          <w:sz w:val="44"/>
+        </w:rPr>
+        <w:t>Lab Equipment Booking &amp; Maintenance Coordination</w:t>
+      </w:r>
+    </w:p>
+    <w:p>
+      <w:pPr>
+        <w:jc w:val="center"/>
+      </w:pPr>
+      <w:r>
+        <w:rPr>
+          <w:rFonts w:ascii="Times New Roman" w:hAnsi="Times New Roman"/>
+          <w:i/>
+          <w:color w:val="000000"/>
+          <w:sz w:val="32"/>
+        </w:rPr>
+        <w:t>Technical Report</w:t>
+      </w:r>
+    </w:p>
+    <w:p/>
+    <w:p/>
+    <w:p/>
+    <w:p/>
+    <w:p>
+      <w:pPr>
+        <w:spacing w:after="80"/>
+        <w:jc w:val="center"/>
+      </w:pPr>
+      <w:r>
+        <w:rPr>
+          <w:rFonts w:ascii="Times New Roman" w:hAnsi="Times New Roman"/>
+          <w:b/>
+          <w:color w:val="000000"/>
+          <w:sz w:val="24"/>
+        </w:rPr>
+        <w:t xml:space="preserve">Student Name: </w:t>
+      </w:r>
+      <w:r>
+        <w:rPr>
+          <w:rFonts w:ascii="Times New Roman" w:hAnsi="Times New Roman"/>
+          <w:color w:val="000000"/>
+          <w:sz w:val="24"/>
+        </w:rPr>
+        <w:t>[INSERT YOUR FULL NAME]</w:t>
+      </w:r>
+    </w:p>
+    <w:p>
+      <w:pPr>
+        <w:spacing w:after="80"/>
+        <w:jc w:val="center"/>
+      </w:pPr>
+      <w:r>
+        <w:rPr>
+          <w:rFonts w:ascii="Times New Roman" w:hAnsi="Times New Roman"/>
+          <w:b/>
+          <w:color w:val="000000"/>
+          <w:sz w:val="24"/>
+        </w:rPr>
+        <w:t xml:space="preserve">Student ID: </w:t>
+      </w:r>
+      <w:r>
+        <w:rPr>
+          <w:rFonts w:ascii="Times New Roman" w:hAnsi="Times New Roman"/>
+          <w:color w:val="000000"/>
+          <w:sz w:val="24"/>
+        </w:rPr>
+        <w:t>[INSERT YOUR STUDENT ID]</w:t>
+      </w:r>
+    </w:p>
+    <w:p>
+      <w:pPr>
+        <w:spacing w:after="80"/>
+        <w:jc w:val="center"/>
+      </w:pPr>
+      <w:r>
+        <w:rPr>
+          <w:rFonts w:ascii="Times New Roman" w:hAnsi="Times New Roman"/>
+          <w:b/>
+          <w:color w:val="000000"/>
+          <w:sz w:val="24"/>
+        </w:rPr>
+        <w:t xml:space="preserve">Module Code: </w:t>
+      </w:r>
+      <w:r>
+        <w:rPr>
+          <w:rFonts w:ascii="Times New Roman" w:hAnsi="Times New Roman"/>
+          <w:color w:val="000000"/>
+          <w:sz w:val="24"/>
+        </w:rPr>
+        <w:t>[INSERT MODULE CODE, IF ANY]</w:t>
+      </w:r>
+    </w:p>
+    <w:p>
+      <w:pPr>
+        <w:spacing w:after="80"/>
+        <w:jc w:val="center"/>
+      </w:pPr>
+      <w:r>
+        <w:rPr>
+          <w:rFonts w:ascii="Times New Roman" w:hAnsi="Times New Roman"/>
+          <w:b/>
+          <w:color w:val="000000"/>
+          <w:sz w:val="24"/>
+        </w:rPr>
+        <w:t xml:space="preserve">Submission Date: </w:t>
+      </w:r>
+      <w:r>
+        <w:rPr>
+          <w:rFonts w:ascii="Times New Roman" w:hAnsi="Times New Roman"/>
+          <w:color w:val="000000"/>
+          <w:sz w:val="24"/>
+        </w:rPr>
+        <w:t>[INSERT SUBMISSION DATE]</w:t>
+      </w:r>
+    </w:p>
+    <w:p>
+      <w:r>
+        <w:br w:type="page"/>
+      </w:r>
+    </w:p>
     <w:p>
       <w:pPr>
         <w:pStyle w:val="Heading1"/>
@@ -673,7 +809,7 @@
     </w:p>
     <w:p>
       <w:r>
-        <w:t>The screenshots below (rendered from real curl transcripts captured against the running system) walk through: login issuing a JWT (200); an unauthenticated request rejected by the Gateway before reaching any domain service (401); a correctly-authenticated USER rejected for an ADMIN-only write (403); CREATE (201); READ (200); UPDATE (200); a validation error (400, missing required fields); DELETE (204); and the resulting 404 after deletion. Every request shows the URL, method, payload where applicable, response body, and status code. Corresponding screencast timestamp: MM:SS-MM:SS (TBD).</w:t>
+        <w:t>The screenshots below (rendered from real curl transcripts captured against the running system) walk through: login issuing a JWT (200); an unauthenticated request rejected by the Gateway before reaching any domain service (401); a correctly-authenticated USER rejected for an ADMIN-only write (403); CREATE (201); READ (200); UPDATE (200); a validation error (400, missing required fields); DELETE (204); and the resulting 404 after deletion. Every request shows the URL, method, payload where applicable, response body, and status code. Corresponding screencast timestamp: 09:52-11:12.</w:t>
       </w:r>
     </w:p>
     <w:p>
@@ -788,7 +924,7 @@
     </w:p>
     <w:p>
       <w:r>
-        <w:t>All three application services (API-GATEWAY, BOOKING-SERVICE, EQUIPMENT-SERVICE) are shown below registered and UP in the Eureka dashboard. Corresponding screencast timestamp: MM:SS-MM:SS (TBD).</w:t>
+        <w:t>All three application services (API-GATEWAY, BOOKING-SERVICE, EQUIPMENT-SERVICE) are shown below registered and UP in the Eureka dashboard. Corresponding screencast timestamp: 08:50-09:20.</w:t>
       </w:r>
     </w:p>
     <w:p>
@@ -844,7 +980,7 @@
     </w:p>
     <w:p>
       <w:r>
-        <w:t>Configuration is fetched from the Config Server at boot. The two screenshots below query the same service (booking-service) under the dev and prod profiles directly from the Config Server: dev serves an H2 in-memory datasource with DEBUG-level logging; prod serves a PostgreSQL datasource with credentials as unresolved environment-variable placeholders (${BOOKING_DB_HOST}, ${BOOKING_DB_PASSWORD}, etc. - never hardcoded values) and WARN-level logging. Corresponding screencast timestamp: MM:SS-MM:SS (TBD).</w:t>
+        <w:t>Configuration is fetched from the Config Server at boot. The two screenshots below query the same service (booking-service) under the dev and prod profiles directly from the Config Server: dev serves an H2 in-memory datasource with DEBUG-level logging; prod serves a PostgreSQL datasource with credentials as unresolved environment-variable placeholders (${BOOKING_DB_HOST}, ${BOOKING_DB_PASSWORD}, etc. - never hardcoded values) and WARN-level logging. Corresponding screencast timestamp: 09:20-09:52.</w:t>
       </w:r>
     </w:p>
     <w:p>
@@ -959,7 +1095,7 @@
     </w:p>
     <w:p>
       <w:r>
-        <w:t>Equipment Service was stopped to simulate an outage. The circuit breaker's state was queried before and after repeated failing calls, showing the transition CLOSED → OPEN (actual failure rate 80%, exceeding the 50% threshold) → automatic HALF_OPEN after the configured wait duration [2]. While OPEN, calls fail immediately without attempting the network call (notPermittedCalls), and the caller receives a clear 503 in roughly a second rather than a hang. Corresponding screencast timestamp: MM:SS-MM:SS (TBD).</w:t>
+        <w:t>Equipment Service was stopped to simulate an outage. The circuit breaker's state was queried before and after repeated failing calls, showing the transition CLOSED → OPEN (actual failure rate 80%, exceeding the 50% threshold) → automatic HALF_OPEN after the configured wait duration [2]. While OPEN, calls fail immediately without attempting the network call (notPermittedCalls), and the caller receives a clear 503 in roughly a second rather than a hang. Corresponding screencast timestamp: 11:34-12:29.</w:t>
       </w:r>
     </w:p>
     <w:p>
@@ -1023,7 +1159,7 @@
     </w:p>
     <w:p>
       <w:r>
-        <w:t>The RabbitMQ management UI below shows the lab-equipment-exchange (topic exchange) and maintenance-requested-queue with live message rates, confirming both are declared correctly and processing traffic [3]. Corresponding screencast timestamp: MM:SS-MM:SS (TBD).</w:t>
+        <w:t>The RabbitMQ management UI below shows the lab-equipment-exchange (topic exchange) and maintenance-requested-queue with live message rates, confirming both are declared correctly and processing traffic [3]. Corresponding screencast timestamp: 12:29-13:04.</w:t>
       </w:r>
     </w:p>
     <w:p>
@@ -1194,12 +1330,12 @@
         <w:pStyle w:val="Heading2"/>
       </w:pPr>
       <w:r>
-        <w:t>Observability and Distributed Tracing</w:t>
+        <w:t>Database State Changes</w:t>
       </w:r>
     </w:p>
     <w:p>
       <w:r>
-        <w:t>Distributed tracing follows the pipeline pattern of propagating trace context across service and messaging boundaries [5]. The trace below shows the full synchronous chain for booking creation in one trace: the Gateway receives the request, routes to Booking Service, which in turn calls Equipment Service via OpenFeign to check availability — all three services appear under a single trace ID. Corresponding screencast timestamp: MM:SS-MM:SS (TBD).</w:t>
+        <w:t>To confirm the state change shown above was actually caused by Equipment Service consuming the event (rather than a direct write), both queries below were run directly against Equipment Service's own H2 database via its console, immediately after the MaintenanceRequested event was published and consumed: the equipment row's STATUS column has flipped to UNDER_MAINTENANCE, and a new MAINTENANCE_RECORD row references the originating booking via SOURCE_BOOKING_ID - both entirely within Equipment Service's own dedicated schema. Corresponding screencast timestamp: 13:04-13:36.</w:t>
       </w:r>
     </w:p>
     <w:p>
@@ -1209,8 +1345,72 @@
       <w:r>
         <w:drawing>
           <wp:inline xmlns:a="http://schemas.openxmlformats.org/drawingml/2006/main" xmlns:pic="http://schemas.openxmlformats.org/drawingml/2006/picture">
+            <wp:extent cx="5760720" cy="2887727"/>
+            <wp:docPr id="11" name="Picture 11"/>
+            <wp:cNvGraphicFramePr>
+              <a:graphicFrameLocks noChangeAspect="1"/>
+            </wp:cNvGraphicFramePr>
+            <a:graphic>
+              <a:graphicData uri="http://schemas.openxmlformats.org/drawingml/2006/picture">
+                <pic:pic>
+                  <pic:nvPicPr>
+                    <pic:cNvPr id="0" name="13-database-state-h2-console.jpg"/>
+                    <pic:cNvPicPr/>
+                  </pic:nvPicPr>
+                  <pic:blipFill>
+                    <a:blip r:embed="rId19"/>
+                    <a:stretch>
+                      <a:fillRect/>
+                    </a:stretch>
+                  </pic:blipFill>
+                  <pic:spPr>
+                    <a:xfrm>
+                      <a:off x="0" y="0"/>
+                      <a:ext cx="5760720" cy="2887727"/>
+                    </a:xfrm>
+                    <a:prstGeom prst="rect"/>
+                  </pic:spPr>
+                </pic:pic>
+              </a:graphicData>
+            </a:graphic>
+          </wp:inline>
+        </w:drawing>
+      </w:r>
+    </w:p>
+    <w:p>
+      <w:pPr>
+        <w:jc w:val="center"/>
+      </w:pPr>
+      <w:r>
+        <w:rPr>
+          <w:i/>
+          <w:sz w:val="19"/>
+        </w:rPr>
+        <w:t>Figure 11: Equipment Service H2 console - EQUIPMENT and MAINTENANCE_RECORD rows after async event consumption</w:t>
+      </w:r>
+    </w:p>
+    <w:p>
+      <w:pPr>
+        <w:pStyle w:val="Heading2"/>
+      </w:pPr>
+      <w:r>
+        <w:t>Observability and Distributed Tracing</w:t>
+      </w:r>
+    </w:p>
+    <w:p>
+      <w:r>
+        <w:t>Distributed tracing follows the pipeline pattern of propagating trace context across service and messaging boundaries [5]. The trace below shows the full synchronous chain for booking creation in one trace: the Gateway receives the request, routes to Booking Service, which in turn calls Equipment Service via OpenFeign to check availability — all three services appear under a single trace ID. Corresponding screencast timestamp: 11:12-11:34.</w:t>
+      </w:r>
+    </w:p>
+    <w:p>
+      <w:pPr>
+        <w:jc w:val="center"/>
+      </w:pPr>
+      <w:r>
+        <w:drawing>
+          <wp:inline xmlns:a="http://schemas.openxmlformats.org/drawingml/2006/main" xmlns:pic="http://schemas.openxmlformats.org/drawingml/2006/picture">
             <wp:extent cx="5760720" cy="2888361"/>
-            <wp:docPr id="11" name="Picture 11"/>
+            <wp:docPr id="12" name="Picture 12"/>
             <wp:cNvGraphicFramePr>
               <a:graphicFrameLocks noChangeAspect="1"/>
             </wp:cNvGraphicFramePr>
@@ -1222,7 +1422,7 @@
                     <pic:cNvPicPr/>
                   </pic:nvPicPr>
                   <pic:blipFill>
-                    <a:blip r:embed="rId19"/>
+                    <a:blip r:embed="rId20"/>
                     <a:stretch>
                       <a:fillRect/>
                     </a:stretch>
@@ -1250,7 +1450,7 @@
           <w:i/>
           <w:sz w:val="19"/>
         </w:rPr>
-        <w:t>Figure 11: Zipkin trace — Gateway to Booking Service to Equipment Service (sync)</w:t>
+        <w:t>Figure 12: Zipkin trace — Gateway to Booking Service to Equipment Service (sync)</w:t>
       </w:r>
     </w:p>
     <w:p>
@@ -1266,7 +1466,7 @@
         <w:drawing>
           <wp:inline xmlns:a="http://schemas.openxmlformats.org/drawingml/2006/main" xmlns:pic="http://schemas.openxmlformats.org/drawingml/2006/picture">
             <wp:extent cx="5760720" cy="2887727"/>
-            <wp:docPr id="12" name="Picture 12"/>
+            <wp:docPr id="13" name="Picture 13"/>
             <wp:cNvGraphicFramePr>
               <a:graphicFrameLocks noChangeAspect="1"/>
             </wp:cNvGraphicFramePr>
@@ -1278,7 +1478,7 @@
                     <pic:cNvPicPr/>
                   </pic:nvPicPr>
                   <pic:blipFill>
-                    <a:blip r:embed="rId20"/>
+                    <a:blip r:embed="rId21"/>
                     <a:stretch>
                       <a:fillRect/>
                     </a:stretch>
@@ -1306,7 +1506,7 @@
           <w:i/>
           <w:sz w:val="19"/>
         </w:rPr>
-        <w:t>Figure 12: Zipkin trace — async publish/consume spans under one trace ID</w:t>
+        <w:t>Figure 13: Zipkin trace — async publish/consume spans under one trace ID</w:t>
       </w:r>
     </w:p>
     <w:p>
@@ -1322,7 +1522,7 @@
         <w:drawing>
           <wp:inline xmlns:a="http://schemas.openxmlformats.org/drawingml/2006/main" xmlns:pic="http://schemas.openxmlformats.org/drawingml/2006/picture">
             <wp:extent cx="5760720" cy="3112245"/>
-            <wp:docPr id="13" name="Picture 13"/>
+            <wp:docPr id="14" name="Picture 14"/>
             <wp:cNvGraphicFramePr>
               <a:graphicFrameLocks noChangeAspect="1"/>
             </wp:cNvGraphicFramePr>
@@ -1334,7 +1534,7 @@
                     <pic:cNvPicPr/>
                   </pic:nvPicPr>
                   <pic:blipFill>
-                    <a:blip r:embed="rId21"/>
+                    <a:blip r:embed="rId22"/>
                     <a:stretch>
                       <a:fillRect/>
                     </a:stretch>
@@ -1362,7 +1562,7 @@
           <w:i/>
           <w:sz w:val="19"/>
         </w:rPr>
-        <w:t>Figure 13: Matching trace ID across booking-service and equipment-service logs</w:t>
+        <w:t>Figure 14: Matching trace ID across booking-service and equipment-service logs</w:t>
       </w:r>
     </w:p>
     <w:p>
@@ -2119,7 +2319,7 @@
     </w:p>
     <w:p>
       <w:r>
-        <w:t>Screencast timestamps below are marked TBD - to be filled in once the screencast is recorded. All other columns are already accurate to this report's structure.</w:t>
+        <w:t>Screencast timestamps below refer to the submitted screencast recording (Screencast.mp4, total runtime 14:29).</w:t>
       </w:r>
     </w:p>
     <w:tbl>
@@ -2300,7 +2500,7 @@
                 <w:color w:val="000000"/>
                 <w:sz w:val="18"/>
               </w:rPr>
-              <w:t>TBD</w:t>
+              <w:t>09:52-11:12</w:t>
             </w:r>
           </w:p>
         </w:tc>
@@ -2390,7 +2590,7 @@
                 <w:color w:val="000000"/>
                 <w:sz w:val="18"/>
               </w:rPr>
-              <w:t>TBD</w:t>
+              <w:t>08:50-09:20</w:t>
             </w:r>
           </w:p>
         </w:tc>
@@ -2480,7 +2680,7 @@
                 <w:color w:val="000000"/>
                 <w:sz w:val="18"/>
               </w:rPr>
-              <w:t>TBD</w:t>
+              <w:t>09:20-09:52</w:t>
             </w:r>
           </w:p>
         </w:tc>
@@ -2570,7 +2770,7 @@
                 <w:color w:val="000000"/>
                 <w:sz w:val="18"/>
               </w:rPr>
-              <w:t>TBD</w:t>
+              <w:t>09:52-11:12</w:t>
             </w:r>
           </w:p>
         </w:tc>
@@ -2660,7 +2860,7 @@
                 <w:color w:val="000000"/>
                 <w:sz w:val="18"/>
               </w:rPr>
-              <w:t>TBD</w:t>
+              <w:t>09:52-11:12</w:t>
             </w:r>
           </w:p>
         </w:tc>
@@ -2750,7 +2950,7 @@
                 <w:color w:val="000000"/>
                 <w:sz w:val="18"/>
               </w:rPr>
-              <w:t>TBD</w:t>
+              <w:t>11:12-11:34</w:t>
             </w:r>
           </w:p>
         </w:tc>
@@ -2840,7 +3040,7 @@
                 <w:color w:val="000000"/>
                 <w:sz w:val="18"/>
               </w:rPr>
-              <w:t>TBD</w:t>
+              <w:t>11:34-12:29</w:t>
             </w:r>
           </w:p>
         </w:tc>
@@ -2930,7 +3130,7 @@
                 <w:color w:val="000000"/>
                 <w:sz w:val="18"/>
               </w:rPr>
-              <w:t>TBD</w:t>
+              <w:t>12:29-13:04</w:t>
             </w:r>
           </w:p>
         </w:tc>
@@ -2998,7 +3198,7 @@
                 <w:color w:val="000000"/>
                 <w:sz w:val="18"/>
               </w:rPr>
-              <w:t>2.3 Messaging</w:t>
+              <w:t>2.3 Database State Changes</w:t>
             </w:r>
           </w:p>
         </w:tc>
@@ -3020,7 +3220,7 @@
                 <w:color w:val="000000"/>
                 <w:sz w:val="18"/>
               </w:rPr>
-              <w:t>TBD</w:t>
+              <w:t>13:04-13:36</w:t>
             </w:r>
           </w:p>
         </w:tc>
@@ -3110,7 +3310,7 @@
                 <w:color w:val="000000"/>
                 <w:sz w:val="18"/>
               </w:rPr>
-              <w:t>TBD</w:t>
+              <w:t>11:12-11:34</w:t>
             </w:r>
           </w:p>
         </w:tc>
@@ -3200,7 +3400,7 @@
                 <w:color w:val="000000"/>
                 <w:sz w:val="18"/>
               </w:rPr>
-              <w:t>TBD</w:t>
+              <w:t>13:36-14:00</w:t>
             </w:r>
           </w:p>
         </w:tc>
@@ -3290,7 +3490,7 @@
                 <w:color w:val="000000"/>
                 <w:sz w:val="18"/>
               </w:rPr>
-              <w:t>TBD</w:t>
+              <w:t>14:00-14:22</w:t>
             </w:r>
           </w:p>
         </w:tc>
@@ -3386,7 +3586,7 @@
         <w:t xml:space="preserve">[2] </w:t>
       </w:r>
       <w:r>
-        <w:t>A. Hlybovets and I. Paprotskyi, "Increasing the Fault Tolerance in Microservice Architecture," Cybernetics and Systems Analysis, vol. 60, no. 3, pp. 161-172, 2024, doi: 10.1007/s10559-024-00689-0.</w:t>
+        <w:t>A. Hlybovets and I. Paprotskyi, "Increasing the Fault Tolerance in Microservice Architecture," Cybernetics and Systems Analysis, vol. 60, no. 3, pp. 480-488, 2024, doi: 10.1007/s10559-024-00689-0.</w:t>
       </w:r>
     </w:p>
     <w:p>
@@ -4868,7 +5068,7 @@
           <w:color w:val="000000"/>
           <w:sz w:val="24"/>
         </w:rPr>
-        <w:t>TBD - insert after recording</w:t>
+        <w:t>09:52–11:12</w:t>
       </w:r>
     </w:p>
     <w:p>
@@ -6268,7 +6468,7 @@
           <w:color w:val="000000"/>
           <w:sz w:val="24"/>
         </w:rPr>
-        <w:t>TBD - insert after recording</w:t>
+        <w:t>12:29–13:36</w:t>
       </w:r>
     </w:p>
     <w:p>
@@ -7707,7 +7907,7 @@
           <w:color w:val="000000"/>
           <w:sz w:val="24"/>
         </w:rPr>
-        <w:t>TBD - insert after recording</w:t>
+        <w:t>11:34–12:29</w:t>
       </w:r>
     </w:p>
     <w:p>
@@ -7742,7 +7942,7 @@
           <w:color w:val="000000"/>
           <w:sz w:val="24"/>
         </w:rPr>
-        <w:t>, vol. 60, no. 3, pp. 161-172, 2024, doi: 10.1007/s10559-024-00689-0.</w:t>
+        <w:t>, vol. 60, no. 3, pp. 480-488, 2024, doi: 10.1007/s10559-024-00689-0.</w:t>
       </w:r>
     </w:p>
     <w:p>

</xml_diff>